<commit_message>
Mobile compound endpoints added
</commit_message>
<xml_diff>
--- a/FLUTTER_API_REFERENCE.docx
+++ b/FLUTTER_API_REFERENCE.docx
@@ -2,7 +2,7 @@
 <file path=word/document.xml><?xml version="1.0" encoding="utf-8"?>
 <w:document xmlns:w="http://schemas.openxmlformats.org/wordprocessingml/2006/main" xmlns:m="http://schemas.openxmlformats.org/officeDocument/2006/math" xmlns:r="http://schemas.openxmlformats.org/officeDocument/2006/relationships" xmlns:o="urn:schemas-microsoft-com:office:office" xmlns:v="urn:schemas-microsoft-com:vml" xmlns:w10="urn:schemas-microsoft-com:office:word" xmlns:a="http://schemas.openxmlformats.org/drawingml/2006/main" xmlns:pic="http://schemas.openxmlformats.org/drawingml/2006/picture" xmlns:wp="http://schemas.openxmlformats.org/drawingml/2006/wordprocessingDrawing">
   <w:body>
-    <w:bookmarkStart w:id="50" w:name="canlıfal-flutter-backend-api-referansı"/>
+    <w:bookmarkStart w:id="55" w:name="canlıfal-flutter-backend-api-referansı"/>
     <w:p>
       <w:pPr>
         <w:pStyle w:val="Heading1"/>
@@ -14070,10 +14070,4034 @@
       </w:r>
     </w:p>
     <w:p>
+      <w:r>
+        <w:pict>
+          <v:rect style="width:0;height:1.5pt" o:hralign="center" o:hrstd="t" o:hr="t"/>
+        </w:pict>
+      </w:r>
+    </w:p>
+    <w:bookmarkEnd w:id="49"/>
+    <w:bookmarkStart w:id="54" w:name="mobil-compound-endpointler"/>
+    <w:p>
+      <w:pPr>
+        <w:pStyle w:val="Heading2"/>
+      </w:pPr>
+      <w:r>
+        <w:t xml:space="preserve">📱 Mobil Compound Endpoint’ler</w:t>
+      </w:r>
+    </w:p>
+    <w:p>
       <w:pPr>
         <w:pStyle w:val="FirstParagraph"/>
       </w:pPr>
       <w:r>
+        <w:t xml:space="preserve">Flutter uygulaması için tek istekle birden fazla veriyi dönen birleşik endpoint’ler.</w:t>
+      </w:r>
+    </w:p>
+    <w:bookmarkStart w:id="50" w:name="get-apimobilehome"/>
+    <w:p>
+      <w:pPr>
+        <w:pStyle w:val="Heading3"/>
+      </w:pPr>
+      <w:r>
+        <w:t xml:space="preserve">GET /api/mobile/home</w:t>
+      </w:r>
+    </w:p>
+    <w:p>
+      <w:pPr>
+        <w:pStyle w:val="FirstParagraph"/>
+      </w:pPr>
+      <w:r>
+        <w:t xml:space="preserve">Ana sayfa feed’i — tek istekle tüm ana sayfa verisini döner.</w:t>
+      </w:r>
+    </w:p>
+    <w:p>
+      <w:pPr>
+        <w:pStyle w:val="BodyText"/>
+      </w:pPr>
+      <w:r>
+        <w:rPr>
+          <w:bCs/>
+          <w:b/>
+        </w:rPr>
+        <w:t xml:space="preserve">Auth:</w:t>
+      </w:r>
+      <w:r>
+        <w:t xml:space="preserve"> </w:t>
+      </w:r>
+      <w:r>
+        <w:rPr>
+          <w:rStyle w:val="VerbatimChar"/>
+        </w:rPr>
+        <w:t xml:space="preserve">Authorization: Bearer &lt;jwt&gt;</w:t>
+      </w:r>
+      <w:r>
+        <w:t xml:space="preserve"> </w:t>
+      </w:r>
+      <w:r>
+        <w:t xml:space="preserve">(zorunlu)</w:t>
+      </w:r>
+    </w:p>
+    <w:p>
+      <w:pPr>
+        <w:pStyle w:val="BodyText"/>
+      </w:pPr>
+      <w:r>
+        <w:rPr>
+          <w:bCs/>
+          <w:b/>
+        </w:rPr>
+        <w:t xml:space="preserve">Response:</w:t>
+      </w:r>
+    </w:p>
+    <w:p>
+      <w:pPr>
+        <w:pStyle w:val="SourceCode"/>
+      </w:pPr>
+      <w:r>
+        <w:rPr>
+          <w:rStyle w:val="FunctionTok"/>
+        </w:rPr>
+        <w:t xml:space="preserve">{</w:t>
+      </w:r>
+      <w:r>
+        <w:br/>
+      </w:r>
+      <w:r>
+        <w:rPr>
+          <w:rStyle w:val="NormalTok"/>
+        </w:rPr>
+        <w:t xml:space="preserve">  </w:t>
+      </w:r>
+      <w:r>
+        <w:rPr>
+          <w:rStyle w:val="DataTypeTok"/>
+        </w:rPr>
+        <w:t xml:space="preserve">"success"</w:t>
+      </w:r>
+      <w:r>
+        <w:rPr>
+          <w:rStyle w:val="FunctionTok"/>
+        </w:rPr>
+        <w:t xml:space="preserve">:</w:t>
+      </w:r>
+      <w:r>
+        <w:rPr>
+          <w:rStyle w:val="NormalTok"/>
+        </w:rPr>
+        <w:t xml:space="preserve"> </w:t>
+      </w:r>
+      <w:r>
+        <w:rPr>
+          <w:rStyle w:val="KeywordTok"/>
+        </w:rPr>
+        <w:t xml:space="preserve">true</w:t>
+      </w:r>
+      <w:r>
+        <w:rPr>
+          <w:rStyle w:val="FunctionTok"/>
+        </w:rPr>
+        <w:t xml:space="preserve">,</w:t>
+      </w:r>
+      <w:r>
+        <w:br/>
+      </w:r>
+      <w:r>
+        <w:rPr>
+          <w:rStyle w:val="NormalTok"/>
+        </w:rPr>
+        <w:t xml:space="preserve">  </w:t>
+      </w:r>
+      <w:r>
+        <w:rPr>
+          <w:rStyle w:val="DataTypeTok"/>
+        </w:rPr>
+        <w:t xml:space="preserve">"data"</w:t>
+      </w:r>
+      <w:r>
+        <w:rPr>
+          <w:rStyle w:val="FunctionTok"/>
+        </w:rPr>
+        <w:t xml:space="preserve">:</w:t>
+      </w:r>
+      <w:r>
+        <w:rPr>
+          <w:rStyle w:val="NormalTok"/>
+        </w:rPr>
+        <w:t xml:space="preserve"> </w:t>
+      </w:r>
+      <w:r>
+        <w:rPr>
+          <w:rStyle w:val="FunctionTok"/>
+        </w:rPr>
+        <w:t xml:space="preserve">{</w:t>
+      </w:r>
+      <w:r>
+        <w:br/>
+      </w:r>
+      <w:r>
+        <w:rPr>
+          <w:rStyle w:val="NormalTok"/>
+        </w:rPr>
+        <w:t xml:space="preserve">    </w:t>
+      </w:r>
+      <w:r>
+        <w:rPr>
+          <w:rStyle w:val="DataTypeTok"/>
+        </w:rPr>
+        <w:t xml:space="preserve">"liveStreams"</w:t>
+      </w:r>
+      <w:r>
+        <w:rPr>
+          <w:rStyle w:val="FunctionTok"/>
+        </w:rPr>
+        <w:t xml:space="preserve">:</w:t>
+      </w:r>
+      <w:r>
+        <w:rPr>
+          <w:rStyle w:val="NormalTok"/>
+        </w:rPr>
+        <w:t xml:space="preserve"> </w:t>
+      </w:r>
+      <w:r>
+        <w:rPr>
+          <w:rStyle w:val="OtherTok"/>
+        </w:rPr>
+        <w:t xml:space="preserve">[</w:t>
+      </w:r>
+      <w:r>
+        <w:rPr>
+          <w:rStyle w:val="FunctionTok"/>
+        </w:rPr>
+        <w:t xml:space="preserve">{</w:t>
+      </w:r>
+      <w:r>
+        <w:rPr>
+          <w:rStyle w:val="NormalTok"/>
+        </w:rPr>
+        <w:t xml:space="preserve"> </w:t>
+      </w:r>
+      <w:r>
+        <w:rPr>
+          <w:rStyle w:val="DataTypeTok"/>
+        </w:rPr>
+        <w:t xml:space="preserve">"id"</w:t>
+      </w:r>
+      <w:r>
+        <w:rPr>
+          <w:rStyle w:val="FunctionTok"/>
+        </w:rPr>
+        <w:t xml:space="preserve">,</w:t>
+      </w:r>
+      <w:r>
+        <w:rPr>
+          <w:rStyle w:val="NormalTok"/>
+        </w:rPr>
+        <w:t xml:space="preserve"> </w:t>
+      </w:r>
+      <w:r>
+        <w:rPr>
+          <w:rStyle w:val="DataTypeTok"/>
+        </w:rPr>
+        <w:t xml:space="preserve">"title"</w:t>
+      </w:r>
+      <w:r>
+        <w:rPr>
+          <w:rStyle w:val="FunctionTok"/>
+        </w:rPr>
+        <w:t xml:space="preserve">,</w:t>
+      </w:r>
+      <w:r>
+        <w:rPr>
+          <w:rStyle w:val="NormalTok"/>
+        </w:rPr>
+        <w:t xml:space="preserve"> </w:t>
+      </w:r>
+      <w:r>
+        <w:rPr>
+          <w:rStyle w:val="DataTypeTok"/>
+        </w:rPr>
+        <w:t xml:space="preserve">"hostId"</w:t>
+      </w:r>
+      <w:r>
+        <w:rPr>
+          <w:rStyle w:val="FunctionTok"/>
+        </w:rPr>
+        <w:t xml:space="preserve">,</w:t>
+      </w:r>
+      <w:r>
+        <w:rPr>
+          <w:rStyle w:val="NormalTok"/>
+        </w:rPr>
+        <w:t xml:space="preserve"> </w:t>
+      </w:r>
+      <w:r>
+        <w:rPr>
+          <w:rStyle w:val="DataTypeTok"/>
+        </w:rPr>
+        <w:t xml:space="preserve">"hostName"</w:t>
+      </w:r>
+      <w:r>
+        <w:rPr>
+          <w:rStyle w:val="FunctionTok"/>
+        </w:rPr>
+        <w:t xml:space="preserve">,</w:t>
+      </w:r>
+      <w:r>
+        <w:rPr>
+          <w:rStyle w:val="NormalTok"/>
+        </w:rPr>
+        <w:t xml:space="preserve"> </w:t>
+      </w:r>
+      <w:r>
+        <w:rPr>
+          <w:rStyle w:val="DataTypeTok"/>
+        </w:rPr>
+        <w:t xml:space="preserve">"hostAvatar"</w:t>
+      </w:r>
+      <w:r>
+        <w:rPr>
+          <w:rStyle w:val="FunctionTok"/>
+        </w:rPr>
+        <w:t xml:space="preserve">,</w:t>
+      </w:r>
+      <w:r>
+        <w:rPr>
+          <w:rStyle w:val="NormalTok"/>
+        </w:rPr>
+        <w:t xml:space="preserve"> </w:t>
+      </w:r>
+      <w:r>
+        <w:rPr>
+          <w:rStyle w:val="DataTypeTok"/>
+        </w:rPr>
+        <w:t xml:space="preserve">"listenerCount"</w:t>
+      </w:r>
+      <w:r>
+        <w:rPr>
+          <w:rStyle w:val="FunctionTok"/>
+        </w:rPr>
+        <w:t xml:space="preserve">,</w:t>
+      </w:r>
+      <w:r>
+        <w:rPr>
+          <w:rStyle w:val="NormalTok"/>
+        </w:rPr>
+        <w:t xml:space="preserve"> </w:t>
+      </w:r>
+      <w:r>
+        <w:rPr>
+          <w:rStyle w:val="DataTypeTok"/>
+        </w:rPr>
+        <w:t xml:space="preserve">"isLive"</w:t>
+      </w:r>
+      <w:r>
+        <w:rPr>
+          <w:rStyle w:val="FunctionTok"/>
+        </w:rPr>
+        <w:t xml:space="preserve">,</w:t>
+      </w:r>
+      <w:r>
+        <w:rPr>
+          <w:rStyle w:val="NormalTok"/>
+        </w:rPr>
+        <w:t xml:space="preserve"> </w:t>
+      </w:r>
+      <w:r>
+        <w:rPr>
+          <w:rStyle w:val="DataTypeTok"/>
+        </w:rPr>
+        <w:t xml:space="preserve">"roomType"</w:t>
+      </w:r>
+      <w:r>
+        <w:rPr>
+          <w:rStyle w:val="NormalTok"/>
+        </w:rPr>
+        <w:t xml:space="preserve"> </w:t>
+      </w:r>
+      <w:r>
+        <w:rPr>
+          <w:rStyle w:val="FunctionTok"/>
+        </w:rPr>
+        <w:t xml:space="preserve">}</w:t>
+      </w:r>
+      <w:r>
+        <w:rPr>
+          <w:rStyle w:val="OtherTok"/>
+        </w:rPr>
+        <w:t xml:space="preserve">]</w:t>
+      </w:r>
+      <w:r>
+        <w:rPr>
+          <w:rStyle w:val="FunctionTok"/>
+        </w:rPr>
+        <w:t xml:space="preserve">,</w:t>
+      </w:r>
+      <w:r>
+        <w:br/>
+      </w:r>
+      <w:r>
+        <w:rPr>
+          <w:rStyle w:val="NormalTok"/>
+        </w:rPr>
+        <w:t xml:space="preserve">    </w:t>
+      </w:r>
+      <w:r>
+        <w:rPr>
+          <w:rStyle w:val="DataTypeTok"/>
+        </w:rPr>
+        <w:t xml:space="preserve">"voiceRooms"</w:t>
+      </w:r>
+      <w:r>
+        <w:rPr>
+          <w:rStyle w:val="FunctionTok"/>
+        </w:rPr>
+        <w:t xml:space="preserve">:</w:t>
+      </w:r>
+      <w:r>
+        <w:rPr>
+          <w:rStyle w:val="NormalTok"/>
+        </w:rPr>
+        <w:t xml:space="preserve"> </w:t>
+      </w:r>
+      <w:r>
+        <w:rPr>
+          <w:rStyle w:val="OtherTok"/>
+        </w:rPr>
+        <w:t xml:space="preserve">[</w:t>
+      </w:r>
+      <w:r>
+        <w:rPr>
+          <w:rStyle w:val="FunctionTok"/>
+        </w:rPr>
+        <w:t xml:space="preserve">{</w:t>
+      </w:r>
+      <w:r>
+        <w:rPr>
+          <w:rStyle w:val="NormalTok"/>
+        </w:rPr>
+        <w:t xml:space="preserve"> </w:t>
+      </w:r>
+      <w:r>
+        <w:rPr>
+          <w:rStyle w:val="DataTypeTok"/>
+        </w:rPr>
+        <w:t xml:space="preserve">"id"</w:t>
+      </w:r>
+      <w:r>
+        <w:rPr>
+          <w:rStyle w:val="FunctionTok"/>
+        </w:rPr>
+        <w:t xml:space="preserve">,</w:t>
+      </w:r>
+      <w:r>
+        <w:rPr>
+          <w:rStyle w:val="NormalTok"/>
+        </w:rPr>
+        <w:t xml:space="preserve"> </w:t>
+      </w:r>
+      <w:r>
+        <w:rPr>
+          <w:rStyle w:val="DataTypeTok"/>
+        </w:rPr>
+        <w:t xml:space="preserve">"name"</w:t>
+      </w:r>
+      <w:r>
+        <w:rPr>
+          <w:rStyle w:val="FunctionTok"/>
+        </w:rPr>
+        <w:t xml:space="preserve">,</w:t>
+      </w:r>
+      <w:r>
+        <w:rPr>
+          <w:rStyle w:val="NormalTok"/>
+        </w:rPr>
+        <w:t xml:space="preserve"> </w:t>
+      </w:r>
+      <w:r>
+        <w:rPr>
+          <w:rStyle w:val="DataTypeTok"/>
+        </w:rPr>
+        <w:t xml:space="preserve">"description"</w:t>
+      </w:r>
+      <w:r>
+        <w:rPr>
+          <w:rStyle w:val="FunctionTok"/>
+        </w:rPr>
+        <w:t xml:space="preserve">,</w:t>
+      </w:r>
+      <w:r>
+        <w:rPr>
+          <w:rStyle w:val="NormalTok"/>
+        </w:rPr>
+        <w:t xml:space="preserve"> </w:t>
+      </w:r>
+      <w:r>
+        <w:rPr>
+          <w:rStyle w:val="DataTypeTok"/>
+        </w:rPr>
+        <w:t xml:space="preserve">"imageUrl"</w:t>
+      </w:r>
+      <w:r>
+        <w:rPr>
+          <w:rStyle w:val="FunctionTok"/>
+        </w:rPr>
+        <w:t xml:space="preserve">,</w:t>
+      </w:r>
+      <w:r>
+        <w:rPr>
+          <w:rStyle w:val="NormalTok"/>
+        </w:rPr>
+        <w:t xml:space="preserve"> </w:t>
+      </w:r>
+      <w:r>
+        <w:rPr>
+          <w:rStyle w:val="DataTypeTok"/>
+        </w:rPr>
+        <w:t xml:space="preserve">"hostId"</w:t>
+      </w:r>
+      <w:r>
+        <w:rPr>
+          <w:rStyle w:val="FunctionTok"/>
+        </w:rPr>
+        <w:t xml:space="preserve">,</w:t>
+      </w:r>
+      <w:r>
+        <w:rPr>
+          <w:rStyle w:val="NormalTok"/>
+        </w:rPr>
+        <w:t xml:space="preserve"> </w:t>
+      </w:r>
+      <w:r>
+        <w:rPr>
+          <w:rStyle w:val="DataTypeTok"/>
+        </w:rPr>
+        <w:t xml:space="preserve">"hostName"</w:t>
+      </w:r>
+      <w:r>
+        <w:rPr>
+          <w:rStyle w:val="FunctionTok"/>
+        </w:rPr>
+        <w:t xml:space="preserve">,</w:t>
+      </w:r>
+      <w:r>
+        <w:rPr>
+          <w:rStyle w:val="NormalTok"/>
+        </w:rPr>
+        <w:t xml:space="preserve"> </w:t>
+      </w:r>
+      <w:r>
+        <w:rPr>
+          <w:rStyle w:val="DataTypeTok"/>
+        </w:rPr>
+        <w:t xml:space="preserve">"isActive"</w:t>
+      </w:r>
+      <w:r>
+        <w:rPr>
+          <w:rStyle w:val="FunctionTok"/>
+        </w:rPr>
+        <w:t xml:space="preserve">,</w:t>
+      </w:r>
+      <w:r>
+        <w:rPr>
+          <w:rStyle w:val="NormalTok"/>
+        </w:rPr>
+        <w:t xml:space="preserve"> </w:t>
+      </w:r>
+      <w:r>
+        <w:rPr>
+          <w:rStyle w:val="DataTypeTok"/>
+        </w:rPr>
+        <w:t xml:space="preserve">"listenerCount"</w:t>
+      </w:r>
+      <w:r>
+        <w:rPr>
+          <w:rStyle w:val="NormalTok"/>
+        </w:rPr>
+        <w:t xml:space="preserve"> </w:t>
+      </w:r>
+      <w:r>
+        <w:rPr>
+          <w:rStyle w:val="FunctionTok"/>
+        </w:rPr>
+        <w:t xml:space="preserve">}</w:t>
+      </w:r>
+      <w:r>
+        <w:rPr>
+          <w:rStyle w:val="OtherTok"/>
+        </w:rPr>
+        <w:t xml:space="preserve">]</w:t>
+      </w:r>
+      <w:r>
+        <w:rPr>
+          <w:rStyle w:val="FunctionTok"/>
+        </w:rPr>
+        <w:t xml:space="preserve">,</w:t>
+      </w:r>
+      <w:r>
+        <w:br/>
+      </w:r>
+      <w:r>
+        <w:rPr>
+          <w:rStyle w:val="NormalTok"/>
+        </w:rPr>
+        <w:t xml:space="preserve">    </w:t>
+      </w:r>
+      <w:r>
+        <w:rPr>
+          <w:rStyle w:val="DataTypeTok"/>
+        </w:rPr>
+        <w:t xml:space="preserve">"fortuneCards"</w:t>
+      </w:r>
+      <w:r>
+        <w:rPr>
+          <w:rStyle w:val="FunctionTok"/>
+        </w:rPr>
+        <w:t xml:space="preserve">:</w:t>
+      </w:r>
+      <w:r>
+        <w:rPr>
+          <w:rStyle w:val="NormalTok"/>
+        </w:rPr>
+        <w:t xml:space="preserve"> </w:t>
+      </w:r>
+      <w:r>
+        <w:rPr>
+          <w:rStyle w:val="OtherTok"/>
+        </w:rPr>
+        <w:t xml:space="preserve">[</w:t>
+      </w:r>
+      <w:r>
+        <w:rPr>
+          <w:rStyle w:val="FunctionTok"/>
+        </w:rPr>
+        <w:t xml:space="preserve">{</w:t>
+      </w:r>
+      <w:r>
+        <w:rPr>
+          <w:rStyle w:val="NormalTok"/>
+        </w:rPr>
+        <w:t xml:space="preserve"> </w:t>
+      </w:r>
+      <w:r>
+        <w:rPr>
+          <w:rStyle w:val="DataTypeTok"/>
+        </w:rPr>
+        <w:t xml:space="preserve">"id"</w:t>
+      </w:r>
+      <w:r>
+        <w:rPr>
+          <w:rStyle w:val="FunctionTok"/>
+        </w:rPr>
+        <w:t xml:space="preserve">,</w:t>
+      </w:r>
+      <w:r>
+        <w:rPr>
+          <w:rStyle w:val="NormalTok"/>
+        </w:rPr>
+        <w:t xml:space="preserve"> </w:t>
+      </w:r>
+      <w:r>
+        <w:rPr>
+          <w:rStyle w:val="DataTypeTok"/>
+        </w:rPr>
+        <w:t xml:space="preserve">"fortuneType"</w:t>
+      </w:r>
+      <w:r>
+        <w:rPr>
+          <w:rStyle w:val="FunctionTok"/>
+        </w:rPr>
+        <w:t xml:space="preserve">,</w:t>
+      </w:r>
+      <w:r>
+        <w:rPr>
+          <w:rStyle w:val="NormalTok"/>
+        </w:rPr>
+        <w:t xml:space="preserve"> </w:t>
+      </w:r>
+      <w:r>
+        <w:rPr>
+          <w:rStyle w:val="DataTypeTok"/>
+        </w:rPr>
+        <w:t xml:space="preserve">"title"</w:t>
+      </w:r>
+      <w:r>
+        <w:rPr>
+          <w:rStyle w:val="FunctionTok"/>
+        </w:rPr>
+        <w:t xml:space="preserve">,</w:t>
+      </w:r>
+      <w:r>
+        <w:rPr>
+          <w:rStyle w:val="NormalTok"/>
+        </w:rPr>
+        <w:t xml:space="preserve"> </w:t>
+      </w:r>
+      <w:r>
+        <w:rPr>
+          <w:rStyle w:val="DataTypeTok"/>
+        </w:rPr>
+        <w:t xml:space="preserve">"description"</w:t>
+      </w:r>
+      <w:r>
+        <w:rPr>
+          <w:rStyle w:val="FunctionTok"/>
+        </w:rPr>
+        <w:t xml:space="preserve">,</w:t>
+      </w:r>
+      <w:r>
+        <w:rPr>
+          <w:rStyle w:val="NormalTok"/>
+        </w:rPr>
+        <w:t xml:space="preserve"> </w:t>
+      </w:r>
+      <w:r>
+        <w:rPr>
+          <w:rStyle w:val="DataTypeTok"/>
+        </w:rPr>
+        <w:t xml:space="preserve">"iconUrl"</w:t>
+      </w:r>
+      <w:r>
+        <w:rPr>
+          <w:rStyle w:val="FunctionTok"/>
+        </w:rPr>
+        <w:t xml:space="preserve">,</w:t>
+      </w:r>
+      <w:r>
+        <w:rPr>
+          <w:rStyle w:val="NormalTok"/>
+        </w:rPr>
+        <w:t xml:space="preserve"> </w:t>
+      </w:r>
+      <w:r>
+        <w:rPr>
+          <w:rStyle w:val="DataTypeTok"/>
+        </w:rPr>
+        <w:t xml:space="preserve">"isActive"</w:t>
+      </w:r>
+      <w:r>
+        <w:rPr>
+          <w:rStyle w:val="FunctionTok"/>
+        </w:rPr>
+        <w:t xml:space="preserve">,</w:t>
+      </w:r>
+      <w:r>
+        <w:rPr>
+          <w:rStyle w:val="NormalTok"/>
+        </w:rPr>
+        <w:t xml:space="preserve"> </w:t>
+      </w:r>
+      <w:r>
+        <w:rPr>
+          <w:rStyle w:val="DataTypeTok"/>
+        </w:rPr>
+        <w:t xml:space="preserve">"sortOrder"</w:t>
+      </w:r>
+      <w:r>
+        <w:rPr>
+          <w:rStyle w:val="NormalTok"/>
+        </w:rPr>
+        <w:t xml:space="preserve"> </w:t>
+      </w:r>
+      <w:r>
+        <w:rPr>
+          <w:rStyle w:val="FunctionTok"/>
+        </w:rPr>
+        <w:t xml:space="preserve">}</w:t>
+      </w:r>
+      <w:r>
+        <w:rPr>
+          <w:rStyle w:val="OtherTok"/>
+        </w:rPr>
+        <w:t xml:space="preserve">]</w:t>
+      </w:r>
+      <w:r>
+        <w:rPr>
+          <w:rStyle w:val="FunctionTok"/>
+        </w:rPr>
+        <w:t xml:space="preserve">,</w:t>
+      </w:r>
+      <w:r>
+        <w:br/>
+      </w:r>
+      <w:r>
+        <w:rPr>
+          <w:rStyle w:val="NormalTok"/>
+        </w:rPr>
+        <w:t xml:space="preserve">    </w:t>
+      </w:r>
+      <w:r>
+        <w:rPr>
+          <w:rStyle w:val="DataTypeTok"/>
+        </w:rPr>
+        <w:t xml:space="preserve">"homepageButtons"</w:t>
+      </w:r>
+      <w:r>
+        <w:rPr>
+          <w:rStyle w:val="FunctionTok"/>
+        </w:rPr>
+        <w:t xml:space="preserve">:</w:t>
+      </w:r>
+      <w:r>
+        <w:rPr>
+          <w:rStyle w:val="NormalTok"/>
+        </w:rPr>
+        <w:t xml:space="preserve"> </w:t>
+      </w:r>
+      <w:r>
+        <w:rPr>
+          <w:rStyle w:val="OtherTok"/>
+        </w:rPr>
+        <w:t xml:space="preserve">[</w:t>
+      </w:r>
+      <w:r>
+        <w:rPr>
+          <w:rStyle w:val="FunctionTok"/>
+        </w:rPr>
+        <w:t xml:space="preserve">{</w:t>
+      </w:r>
+      <w:r>
+        <w:rPr>
+          <w:rStyle w:val="NormalTok"/>
+        </w:rPr>
+        <w:t xml:space="preserve"> </w:t>
+      </w:r>
+      <w:r>
+        <w:rPr>
+          <w:rStyle w:val="DataTypeTok"/>
+        </w:rPr>
+        <w:t xml:space="preserve">"id"</w:t>
+      </w:r>
+      <w:r>
+        <w:rPr>
+          <w:rStyle w:val="FunctionTok"/>
+        </w:rPr>
+        <w:t xml:space="preserve">,</w:t>
+      </w:r>
+      <w:r>
+        <w:rPr>
+          <w:rStyle w:val="NormalTok"/>
+        </w:rPr>
+        <w:t xml:space="preserve"> </w:t>
+      </w:r>
+      <w:r>
+        <w:rPr>
+          <w:rStyle w:val="DataTypeTok"/>
+        </w:rPr>
+        <w:t xml:space="preserve">"label"</w:t>
+      </w:r>
+      <w:r>
+        <w:rPr>
+          <w:rStyle w:val="FunctionTok"/>
+        </w:rPr>
+        <w:t xml:space="preserve">,</w:t>
+      </w:r>
+      <w:r>
+        <w:rPr>
+          <w:rStyle w:val="NormalTok"/>
+        </w:rPr>
+        <w:t xml:space="preserve"> </w:t>
+      </w:r>
+      <w:r>
+        <w:rPr>
+          <w:rStyle w:val="DataTypeTok"/>
+        </w:rPr>
+        <w:t xml:space="preserve">"iconUrl"</w:t>
+      </w:r>
+      <w:r>
+        <w:rPr>
+          <w:rStyle w:val="FunctionTok"/>
+        </w:rPr>
+        <w:t xml:space="preserve">,</w:t>
+      </w:r>
+      <w:r>
+        <w:rPr>
+          <w:rStyle w:val="NormalTok"/>
+        </w:rPr>
+        <w:t xml:space="preserve"> </w:t>
+      </w:r>
+      <w:r>
+        <w:rPr>
+          <w:rStyle w:val="DataTypeTok"/>
+        </w:rPr>
+        <w:t xml:space="preserve">"linkUrl"</w:t>
+      </w:r>
+      <w:r>
+        <w:rPr>
+          <w:rStyle w:val="FunctionTok"/>
+        </w:rPr>
+        <w:t xml:space="preserve">,</w:t>
+      </w:r>
+      <w:r>
+        <w:rPr>
+          <w:rStyle w:val="NormalTok"/>
+        </w:rPr>
+        <w:t xml:space="preserve"> </w:t>
+      </w:r>
+      <w:r>
+        <w:rPr>
+          <w:rStyle w:val="DataTypeTok"/>
+        </w:rPr>
+        <w:t xml:space="preserve">"sortOrder"</w:t>
+      </w:r>
+      <w:r>
+        <w:rPr>
+          <w:rStyle w:val="FunctionTok"/>
+        </w:rPr>
+        <w:t xml:space="preserve">,</w:t>
+      </w:r>
+      <w:r>
+        <w:rPr>
+          <w:rStyle w:val="NormalTok"/>
+        </w:rPr>
+        <w:t xml:space="preserve"> </w:t>
+      </w:r>
+      <w:r>
+        <w:rPr>
+          <w:rStyle w:val="DataTypeTok"/>
+        </w:rPr>
+        <w:t xml:space="preserve">"isActive"</w:t>
+      </w:r>
+      <w:r>
+        <w:rPr>
+          <w:rStyle w:val="NormalTok"/>
+        </w:rPr>
+        <w:t xml:space="preserve"> </w:t>
+      </w:r>
+      <w:r>
+        <w:rPr>
+          <w:rStyle w:val="FunctionTok"/>
+        </w:rPr>
+        <w:t xml:space="preserve">}</w:t>
+      </w:r>
+      <w:r>
+        <w:rPr>
+          <w:rStyle w:val="OtherTok"/>
+        </w:rPr>
+        <w:t xml:space="preserve">]</w:t>
+      </w:r>
+      <w:r>
+        <w:rPr>
+          <w:rStyle w:val="FunctionTok"/>
+        </w:rPr>
+        <w:t xml:space="preserve">,</w:t>
+      </w:r>
+      <w:r>
+        <w:br/>
+      </w:r>
+      <w:r>
+        <w:rPr>
+          <w:rStyle w:val="NormalTok"/>
+        </w:rPr>
+        <w:t xml:space="preserve">    </w:t>
+      </w:r>
+      <w:r>
+        <w:rPr>
+          <w:rStyle w:val="DataTypeTok"/>
+        </w:rPr>
+        <w:t xml:space="preserve">"announcements"</w:t>
+      </w:r>
+      <w:r>
+        <w:rPr>
+          <w:rStyle w:val="FunctionTok"/>
+        </w:rPr>
+        <w:t xml:space="preserve">:</w:t>
+      </w:r>
+      <w:r>
+        <w:rPr>
+          <w:rStyle w:val="NormalTok"/>
+        </w:rPr>
+        <w:t xml:space="preserve"> </w:t>
+      </w:r>
+      <w:r>
+        <w:rPr>
+          <w:rStyle w:val="OtherTok"/>
+        </w:rPr>
+        <w:t xml:space="preserve">[</w:t>
+      </w:r>
+      <w:r>
+        <w:rPr>
+          <w:rStyle w:val="FunctionTok"/>
+        </w:rPr>
+        <w:t xml:space="preserve">{</w:t>
+      </w:r>
+      <w:r>
+        <w:rPr>
+          <w:rStyle w:val="NormalTok"/>
+        </w:rPr>
+        <w:t xml:space="preserve"> </w:t>
+      </w:r>
+      <w:r>
+        <w:rPr>
+          <w:rStyle w:val="DataTypeTok"/>
+        </w:rPr>
+        <w:t xml:space="preserve">"id"</w:t>
+      </w:r>
+      <w:r>
+        <w:rPr>
+          <w:rStyle w:val="FunctionTok"/>
+        </w:rPr>
+        <w:t xml:space="preserve">,</w:t>
+      </w:r>
+      <w:r>
+        <w:rPr>
+          <w:rStyle w:val="NormalTok"/>
+        </w:rPr>
+        <w:t xml:space="preserve"> </w:t>
+      </w:r>
+      <w:r>
+        <w:rPr>
+          <w:rStyle w:val="DataTypeTok"/>
+        </w:rPr>
+        <w:t xml:space="preserve">"message"</w:t>
+      </w:r>
+      <w:r>
+        <w:rPr>
+          <w:rStyle w:val="FunctionTok"/>
+        </w:rPr>
+        <w:t xml:space="preserve">,</w:t>
+      </w:r>
+      <w:r>
+        <w:rPr>
+          <w:rStyle w:val="NormalTok"/>
+        </w:rPr>
+        <w:t xml:space="preserve"> </w:t>
+      </w:r>
+      <w:r>
+        <w:rPr>
+          <w:rStyle w:val="DataTypeTok"/>
+        </w:rPr>
+        <w:t xml:space="preserve">"type"</w:t>
+      </w:r>
+      <w:r>
+        <w:rPr>
+          <w:rStyle w:val="FunctionTok"/>
+        </w:rPr>
+        <w:t xml:space="preserve">,</w:t>
+      </w:r>
+      <w:r>
+        <w:rPr>
+          <w:rStyle w:val="NormalTok"/>
+        </w:rPr>
+        <w:t xml:space="preserve"> </w:t>
+      </w:r>
+      <w:r>
+        <w:rPr>
+          <w:rStyle w:val="DataTypeTok"/>
+        </w:rPr>
+        <w:t xml:space="preserve">"color"</w:t>
+      </w:r>
+      <w:r>
+        <w:rPr>
+          <w:rStyle w:val="FunctionTok"/>
+        </w:rPr>
+        <w:t xml:space="preserve">,</w:t>
+      </w:r>
+      <w:r>
+        <w:rPr>
+          <w:rStyle w:val="NormalTok"/>
+        </w:rPr>
+        <w:t xml:space="preserve"> </w:t>
+      </w:r>
+      <w:r>
+        <w:rPr>
+          <w:rStyle w:val="DataTypeTok"/>
+        </w:rPr>
+        <w:t xml:space="preserve">"userName"</w:t>
+      </w:r>
+      <w:r>
+        <w:rPr>
+          <w:rStyle w:val="FunctionTok"/>
+        </w:rPr>
+        <w:t xml:space="preserve">,</w:t>
+      </w:r>
+      <w:r>
+        <w:rPr>
+          <w:rStyle w:val="NormalTok"/>
+        </w:rPr>
+        <w:t xml:space="preserve"> </w:t>
+      </w:r>
+      <w:r>
+        <w:rPr>
+          <w:rStyle w:val="DataTypeTok"/>
+        </w:rPr>
+        <w:t xml:space="preserve">"expiresAt"</w:t>
+      </w:r>
+      <w:r>
+        <w:rPr>
+          <w:rStyle w:val="FunctionTok"/>
+        </w:rPr>
+        <w:t xml:space="preserve">,</w:t>
+      </w:r>
+      <w:r>
+        <w:rPr>
+          <w:rStyle w:val="NormalTok"/>
+        </w:rPr>
+        <w:t xml:space="preserve"> </w:t>
+      </w:r>
+      <w:r>
+        <w:rPr>
+          <w:rStyle w:val="DataTypeTok"/>
+        </w:rPr>
+        <w:t xml:space="preserve">"maxPasses"</w:t>
+      </w:r>
+      <w:r>
+        <w:rPr>
+          <w:rStyle w:val="NormalTok"/>
+        </w:rPr>
+        <w:t xml:space="preserve"> </w:t>
+      </w:r>
+      <w:r>
+        <w:rPr>
+          <w:rStyle w:val="FunctionTok"/>
+        </w:rPr>
+        <w:t xml:space="preserve">}</w:t>
+      </w:r>
+      <w:r>
+        <w:rPr>
+          <w:rStyle w:val="OtherTok"/>
+        </w:rPr>
+        <w:t xml:space="preserve">]</w:t>
+      </w:r>
+      <w:r>
+        <w:rPr>
+          <w:rStyle w:val="FunctionTok"/>
+        </w:rPr>
+        <w:t xml:space="preserve">,</w:t>
+      </w:r>
+      <w:r>
+        <w:br/>
+      </w:r>
+      <w:r>
+        <w:rPr>
+          <w:rStyle w:val="NormalTok"/>
+        </w:rPr>
+        <w:t xml:space="preserve">    </w:t>
+      </w:r>
+      <w:r>
+        <w:rPr>
+          <w:rStyle w:val="DataTypeTok"/>
+        </w:rPr>
+        <w:t xml:space="preserve">"liveTellers"</w:t>
+      </w:r>
+      <w:r>
+        <w:rPr>
+          <w:rStyle w:val="FunctionTok"/>
+        </w:rPr>
+        <w:t xml:space="preserve">:</w:t>
+      </w:r>
+      <w:r>
+        <w:rPr>
+          <w:rStyle w:val="NormalTok"/>
+        </w:rPr>
+        <w:t xml:space="preserve"> </w:t>
+      </w:r>
+      <w:r>
+        <w:rPr>
+          <w:rStyle w:val="OtherTok"/>
+        </w:rPr>
+        <w:t xml:space="preserve">[</w:t>
+      </w:r>
+      <w:r>
+        <w:rPr>
+          <w:rStyle w:val="FunctionTok"/>
+        </w:rPr>
+        <w:t xml:space="preserve">{</w:t>
+      </w:r>
+      <w:r>
+        <w:rPr>
+          <w:rStyle w:val="NormalTok"/>
+        </w:rPr>
+        <w:t xml:space="preserve"> </w:t>
+      </w:r>
+      <w:r>
+        <w:rPr>
+          <w:rStyle w:val="DataTypeTok"/>
+        </w:rPr>
+        <w:t xml:space="preserve">"id"</w:t>
+      </w:r>
+      <w:r>
+        <w:rPr>
+          <w:rStyle w:val="FunctionTok"/>
+        </w:rPr>
+        <w:t xml:space="preserve">,</w:t>
+      </w:r>
+      <w:r>
+        <w:rPr>
+          <w:rStyle w:val="NormalTok"/>
+        </w:rPr>
+        <w:t xml:space="preserve"> </w:t>
+      </w:r>
+      <w:r>
+        <w:rPr>
+          <w:rStyle w:val="DataTypeTok"/>
+        </w:rPr>
+        <w:t xml:space="preserve">"user"</w:t>
+      </w:r>
+      <w:r>
+        <w:rPr>
+          <w:rStyle w:val="FunctionTok"/>
+        </w:rPr>
+        <w:t xml:space="preserve">:</w:t>
+      </w:r>
+      <w:r>
+        <w:rPr>
+          <w:rStyle w:val="NormalTok"/>
+        </w:rPr>
+        <w:t xml:space="preserve"> </w:t>
+      </w:r>
+      <w:r>
+        <w:rPr>
+          <w:rStyle w:val="FunctionTok"/>
+        </w:rPr>
+        <w:t xml:space="preserve">{</w:t>
+      </w:r>
+      <w:r>
+        <w:rPr>
+          <w:rStyle w:val="NormalTok"/>
+        </w:rPr>
+        <w:t xml:space="preserve"> </w:t>
+      </w:r>
+      <w:r>
+        <w:rPr>
+          <w:rStyle w:val="DataTypeTok"/>
+        </w:rPr>
+        <w:t xml:space="preserve">"name"</w:t>
+      </w:r>
+      <w:r>
+        <w:rPr>
+          <w:rStyle w:val="FunctionTok"/>
+        </w:rPr>
+        <w:t xml:space="preserve">,</w:t>
+      </w:r>
+      <w:r>
+        <w:rPr>
+          <w:rStyle w:val="NormalTok"/>
+        </w:rPr>
+        <w:t xml:space="preserve"> </w:t>
+      </w:r>
+      <w:r>
+        <w:rPr>
+          <w:rStyle w:val="DataTypeTok"/>
+        </w:rPr>
+        <w:t xml:space="preserve">"profileImageUrl"</w:t>
+      </w:r>
+      <w:r>
+        <w:rPr>
+          <w:rStyle w:val="NormalTok"/>
+        </w:rPr>
+        <w:t xml:space="preserve"> </w:t>
+      </w:r>
+      <w:r>
+        <w:rPr>
+          <w:rStyle w:val="FunctionTok"/>
+        </w:rPr>
+        <w:t xml:space="preserve">},</w:t>
+      </w:r>
+      <w:r>
+        <w:rPr>
+          <w:rStyle w:val="NormalTok"/>
+        </w:rPr>
+        <w:t xml:space="preserve"> </w:t>
+      </w:r>
+      <w:r>
+        <w:rPr>
+          <w:rStyle w:val="DataTypeTok"/>
+        </w:rPr>
+        <w:t xml:space="preserve">"specialties"</w:t>
+      </w:r>
+      <w:r>
+        <w:rPr>
+          <w:rStyle w:val="FunctionTok"/>
+        </w:rPr>
+        <w:t xml:space="preserve">,</w:t>
+      </w:r>
+      <w:r>
+        <w:rPr>
+          <w:rStyle w:val="NormalTok"/>
+        </w:rPr>
+        <w:t xml:space="preserve"> </w:t>
+      </w:r>
+      <w:r>
+        <w:rPr>
+          <w:rStyle w:val="DataTypeTok"/>
+        </w:rPr>
+        <w:t xml:space="preserve">"pricePerSession"</w:t>
+      </w:r>
+      <w:r>
+        <w:rPr>
+          <w:rStyle w:val="FunctionTok"/>
+        </w:rPr>
+        <w:t xml:space="preserve">,</w:t>
+      </w:r>
+      <w:r>
+        <w:rPr>
+          <w:rStyle w:val="NormalTok"/>
+        </w:rPr>
+        <w:t xml:space="preserve"> </w:t>
+      </w:r>
+      <w:r>
+        <w:rPr>
+          <w:rStyle w:val="DataTypeTok"/>
+        </w:rPr>
+        <w:t xml:space="preserve">"rating"</w:t>
+      </w:r>
+      <w:r>
+        <w:rPr>
+          <w:rStyle w:val="FunctionTok"/>
+        </w:rPr>
+        <w:t xml:space="preserve">,</w:t>
+      </w:r>
+      <w:r>
+        <w:rPr>
+          <w:rStyle w:val="NormalTok"/>
+        </w:rPr>
+        <w:t xml:space="preserve"> </w:t>
+      </w:r>
+      <w:r>
+        <w:rPr>
+          <w:rStyle w:val="DataTypeTok"/>
+        </w:rPr>
+        <w:t xml:space="preserve">"isActive"</w:t>
+      </w:r>
+      <w:r>
+        <w:rPr>
+          <w:rStyle w:val="NormalTok"/>
+        </w:rPr>
+        <w:t xml:space="preserve"> </w:t>
+      </w:r>
+      <w:r>
+        <w:rPr>
+          <w:rStyle w:val="FunctionTok"/>
+        </w:rPr>
+        <w:t xml:space="preserve">}</w:t>
+      </w:r>
+      <w:r>
+        <w:rPr>
+          <w:rStyle w:val="OtherTok"/>
+        </w:rPr>
+        <w:t xml:space="preserve">]</w:t>
+      </w:r>
+      <w:r>
+        <w:rPr>
+          <w:rStyle w:val="FunctionTok"/>
+        </w:rPr>
+        <w:t xml:space="preserve">,</w:t>
+      </w:r>
+      <w:r>
+        <w:br/>
+      </w:r>
+      <w:r>
+        <w:rPr>
+          <w:rStyle w:val="NormalTok"/>
+        </w:rPr>
+        <w:t xml:space="preserve">    </w:t>
+      </w:r>
+      <w:r>
+        <w:rPr>
+          <w:rStyle w:val="DataTypeTok"/>
+        </w:rPr>
+        <w:t xml:space="preserve">"user"</w:t>
+      </w:r>
+      <w:r>
+        <w:rPr>
+          <w:rStyle w:val="FunctionTok"/>
+        </w:rPr>
+        <w:t xml:space="preserve">:</w:t>
+      </w:r>
+      <w:r>
+        <w:rPr>
+          <w:rStyle w:val="NormalTok"/>
+        </w:rPr>
+        <w:t xml:space="preserve"> </w:t>
+      </w:r>
+      <w:r>
+        <w:rPr>
+          <w:rStyle w:val="FunctionTok"/>
+        </w:rPr>
+        <w:t xml:space="preserve">{</w:t>
+      </w:r>
+      <w:r>
+        <w:rPr>
+          <w:rStyle w:val="NormalTok"/>
+        </w:rPr>
+        <w:t xml:space="preserve"> </w:t>
+      </w:r>
+      <w:r>
+        <w:rPr>
+          <w:rStyle w:val="DataTypeTok"/>
+        </w:rPr>
+        <w:t xml:space="preserve">"id"</w:t>
+      </w:r>
+      <w:r>
+        <w:rPr>
+          <w:rStyle w:val="FunctionTok"/>
+        </w:rPr>
+        <w:t xml:space="preserve">,</w:t>
+      </w:r>
+      <w:r>
+        <w:rPr>
+          <w:rStyle w:val="NormalTok"/>
+        </w:rPr>
+        <w:t xml:space="preserve"> </w:t>
+      </w:r>
+      <w:r>
+        <w:rPr>
+          <w:rStyle w:val="DataTypeTok"/>
+        </w:rPr>
+        <w:t xml:space="preserve">"name"</w:t>
+      </w:r>
+      <w:r>
+        <w:rPr>
+          <w:rStyle w:val="FunctionTok"/>
+        </w:rPr>
+        <w:t xml:space="preserve">,</w:t>
+      </w:r>
+      <w:r>
+        <w:rPr>
+          <w:rStyle w:val="NormalTok"/>
+        </w:rPr>
+        <w:t xml:space="preserve"> </w:t>
+      </w:r>
+      <w:r>
+        <w:rPr>
+          <w:rStyle w:val="DataTypeTok"/>
+        </w:rPr>
+        <w:t xml:space="preserve">"profileImageUrl"</w:t>
+      </w:r>
+      <w:r>
+        <w:rPr>
+          <w:rStyle w:val="FunctionTok"/>
+        </w:rPr>
+        <w:t xml:space="preserve">,</w:t>
+      </w:r>
+      <w:r>
+        <w:rPr>
+          <w:rStyle w:val="NormalTok"/>
+        </w:rPr>
+        <w:t xml:space="preserve"> </w:t>
+      </w:r>
+      <w:r>
+        <w:rPr>
+          <w:rStyle w:val="DataTypeTok"/>
+        </w:rPr>
+        <w:t xml:space="preserve">"jetons"</w:t>
+      </w:r>
+      <w:r>
+        <w:rPr>
+          <w:rStyle w:val="FunctionTok"/>
+        </w:rPr>
+        <w:t xml:space="preserve">,</w:t>
+      </w:r>
+      <w:r>
+        <w:rPr>
+          <w:rStyle w:val="NormalTok"/>
+        </w:rPr>
+        <w:t xml:space="preserve"> </w:t>
+      </w:r>
+      <w:r>
+        <w:rPr>
+          <w:rStyle w:val="DataTypeTok"/>
+        </w:rPr>
+        <w:t xml:space="preserve">"credits"</w:t>
+      </w:r>
+      <w:r>
+        <w:rPr>
+          <w:rStyle w:val="FunctionTok"/>
+        </w:rPr>
+        <w:t xml:space="preserve">,</w:t>
+      </w:r>
+      <w:r>
+        <w:rPr>
+          <w:rStyle w:val="NormalTok"/>
+        </w:rPr>
+        <w:t xml:space="preserve"> </w:t>
+      </w:r>
+      <w:r>
+        <w:rPr>
+          <w:rStyle w:val="DataTypeTok"/>
+        </w:rPr>
+        <w:t xml:space="preserve">"level"</w:t>
+      </w:r>
+      <w:r>
+        <w:rPr>
+          <w:rStyle w:val="FunctionTok"/>
+        </w:rPr>
+        <w:t xml:space="preserve">,</w:t>
+      </w:r>
+      <w:r>
+        <w:rPr>
+          <w:rStyle w:val="NormalTok"/>
+        </w:rPr>
+        <w:t xml:space="preserve"> </w:t>
+      </w:r>
+      <w:r>
+        <w:rPr>
+          <w:rStyle w:val="DataTypeTok"/>
+        </w:rPr>
+        <w:t xml:space="preserve">"unreadNotifications"</w:t>
+      </w:r>
+      <w:r>
+        <w:rPr>
+          <w:rStyle w:val="NormalTok"/>
+        </w:rPr>
+        <w:t xml:space="preserve"> </w:t>
+      </w:r>
+      <w:r>
+        <w:rPr>
+          <w:rStyle w:val="FunctionTok"/>
+        </w:rPr>
+        <w:t xml:space="preserve">}</w:t>
+      </w:r>
+      <w:r>
+        <w:br/>
+      </w:r>
+      <w:r>
+        <w:rPr>
+          <w:rStyle w:val="NormalTok"/>
+        </w:rPr>
+        <w:t xml:space="preserve">  </w:t>
+      </w:r>
+      <w:r>
+        <w:rPr>
+          <w:rStyle w:val="FunctionTok"/>
+        </w:rPr>
+        <w:t xml:space="preserve">}</w:t>
+      </w:r>
+      <w:r>
+        <w:br/>
+      </w:r>
+      <w:r>
+        <w:rPr>
+          <w:rStyle w:val="FunctionTok"/>
+        </w:rPr>
+        <w:t xml:space="preserve">}</w:t>
+      </w:r>
+    </w:p>
+    <w:p>
+      <w:r>
+        <w:pict>
+          <v:rect style="width:0;height:1.5pt" o:hralign="center" o:hrstd="t" o:hr="t"/>
+        </w:pict>
+      </w:r>
+    </w:p>
+    <w:bookmarkEnd w:id="50"/>
+    <w:bookmarkStart w:id="51" w:name="get-apimobilefortune-menu"/>
+    <w:p>
+      <w:pPr>
+        <w:pStyle w:val="Heading3"/>
+      </w:pPr>
+      <w:r>
+        <w:t xml:space="preserve">GET /api/mobile/fortune-menu</w:t>
+      </w:r>
+    </w:p>
+    <w:p>
+      <w:pPr>
+        <w:pStyle w:val="FirstParagraph"/>
+      </w:pPr>
+      <w:r>
+        <w:t xml:space="preserve">Fal menüsü — tüm fal türlerini, fiyatlarını ve kullanıcı bakiyesini döner.</w:t>
+      </w:r>
+    </w:p>
+    <w:p>
+      <w:pPr>
+        <w:pStyle w:val="BodyText"/>
+      </w:pPr>
+      <w:r>
+        <w:rPr>
+          <w:bCs/>
+          <w:b/>
+        </w:rPr>
+        <w:t xml:space="preserve">Auth:</w:t>
+      </w:r>
+      <w:r>
+        <w:t xml:space="preserve"> </w:t>
+      </w:r>
+      <w:r>
+        <w:rPr>
+          <w:rStyle w:val="VerbatimChar"/>
+        </w:rPr>
+        <w:t xml:space="preserve">Authorization: Bearer &lt;jwt&gt;</w:t>
+      </w:r>
+      <w:r>
+        <w:t xml:space="preserve"> </w:t>
+      </w:r>
+      <w:r>
+        <w:t xml:space="preserve">(zorunlu)</w:t>
+      </w:r>
+    </w:p>
+    <w:p>
+      <w:pPr>
+        <w:pStyle w:val="BodyText"/>
+      </w:pPr>
+      <w:r>
+        <w:rPr>
+          <w:bCs/>
+          <w:b/>
+        </w:rPr>
+        <w:t xml:space="preserve">Response:</w:t>
+      </w:r>
+    </w:p>
+    <w:p>
+      <w:pPr>
+        <w:pStyle w:val="SourceCode"/>
+      </w:pPr>
+      <w:r>
+        <w:rPr>
+          <w:rStyle w:val="FunctionTok"/>
+        </w:rPr>
+        <w:t xml:space="preserve">{</w:t>
+      </w:r>
+      <w:r>
+        <w:br/>
+      </w:r>
+      <w:r>
+        <w:rPr>
+          <w:rStyle w:val="NormalTok"/>
+        </w:rPr>
+        <w:t xml:space="preserve">  </w:t>
+      </w:r>
+      <w:r>
+        <w:rPr>
+          <w:rStyle w:val="DataTypeTok"/>
+        </w:rPr>
+        <w:t xml:space="preserve">"success"</w:t>
+      </w:r>
+      <w:r>
+        <w:rPr>
+          <w:rStyle w:val="FunctionTok"/>
+        </w:rPr>
+        <w:t xml:space="preserve">:</w:t>
+      </w:r>
+      <w:r>
+        <w:rPr>
+          <w:rStyle w:val="NormalTok"/>
+        </w:rPr>
+        <w:t xml:space="preserve"> </w:t>
+      </w:r>
+      <w:r>
+        <w:rPr>
+          <w:rStyle w:val="KeywordTok"/>
+        </w:rPr>
+        <w:t xml:space="preserve">true</w:t>
+      </w:r>
+      <w:r>
+        <w:rPr>
+          <w:rStyle w:val="FunctionTok"/>
+        </w:rPr>
+        <w:t xml:space="preserve">,</w:t>
+      </w:r>
+      <w:r>
+        <w:br/>
+      </w:r>
+      <w:r>
+        <w:rPr>
+          <w:rStyle w:val="NormalTok"/>
+        </w:rPr>
+        <w:t xml:space="preserve">  </w:t>
+      </w:r>
+      <w:r>
+        <w:rPr>
+          <w:rStyle w:val="DataTypeTok"/>
+        </w:rPr>
+        <w:t xml:space="preserve">"data"</w:t>
+      </w:r>
+      <w:r>
+        <w:rPr>
+          <w:rStyle w:val="FunctionTok"/>
+        </w:rPr>
+        <w:t xml:space="preserve">:</w:t>
+      </w:r>
+      <w:r>
+        <w:rPr>
+          <w:rStyle w:val="NormalTok"/>
+        </w:rPr>
+        <w:t xml:space="preserve"> </w:t>
+      </w:r>
+      <w:r>
+        <w:rPr>
+          <w:rStyle w:val="FunctionTok"/>
+        </w:rPr>
+        <w:t xml:space="preserve">{</w:t>
+      </w:r>
+      <w:r>
+        <w:br/>
+      </w:r>
+      <w:r>
+        <w:rPr>
+          <w:rStyle w:val="NormalTok"/>
+        </w:rPr>
+        <w:t xml:space="preserve">    </w:t>
+      </w:r>
+      <w:r>
+        <w:rPr>
+          <w:rStyle w:val="DataTypeTok"/>
+        </w:rPr>
+        <w:t xml:space="preserve">"fortuneTypes"</w:t>
+      </w:r>
+      <w:r>
+        <w:rPr>
+          <w:rStyle w:val="FunctionTok"/>
+        </w:rPr>
+        <w:t xml:space="preserve">:</w:t>
+      </w:r>
+      <w:r>
+        <w:rPr>
+          <w:rStyle w:val="NormalTok"/>
+        </w:rPr>
+        <w:t xml:space="preserve"> </w:t>
+      </w:r>
+      <w:r>
+        <w:rPr>
+          <w:rStyle w:val="OtherTok"/>
+        </w:rPr>
+        <w:t xml:space="preserve">[</w:t>
+      </w:r>
+      <w:r>
+        <w:rPr>
+          <w:rStyle w:val="FunctionTok"/>
+        </w:rPr>
+        <w:t xml:space="preserve">{</w:t>
+      </w:r>
+      <w:r>
+        <w:br/>
+      </w:r>
+      <w:r>
+        <w:rPr>
+          <w:rStyle w:val="NormalTok"/>
+        </w:rPr>
+        <w:t xml:space="preserve">      </w:t>
+      </w:r>
+      <w:r>
+        <w:rPr>
+          <w:rStyle w:val="DataTypeTok"/>
+        </w:rPr>
+        <w:t xml:space="preserve">"id"</w:t>
+      </w:r>
+      <w:r>
+        <w:rPr>
+          <w:rStyle w:val="FunctionTok"/>
+        </w:rPr>
+        <w:t xml:space="preserve">,</w:t>
+      </w:r>
+      <w:r>
+        <w:rPr>
+          <w:rStyle w:val="NormalTok"/>
+        </w:rPr>
+        <w:t xml:space="preserve"> </w:t>
+      </w:r>
+      <w:r>
+        <w:rPr>
+          <w:rStyle w:val="DataTypeTok"/>
+        </w:rPr>
+        <w:t xml:space="preserve">"slug"</w:t>
+      </w:r>
+      <w:r>
+        <w:rPr>
+          <w:rStyle w:val="FunctionTok"/>
+        </w:rPr>
+        <w:t xml:space="preserve">,</w:t>
+      </w:r>
+      <w:r>
+        <w:rPr>
+          <w:rStyle w:val="NormalTok"/>
+        </w:rPr>
+        <w:t xml:space="preserve"> </w:t>
+      </w:r>
+      <w:r>
+        <w:rPr>
+          <w:rStyle w:val="DataTypeTok"/>
+        </w:rPr>
+        <w:t xml:space="preserve">"nameTr"</w:t>
+      </w:r>
+      <w:r>
+        <w:rPr>
+          <w:rStyle w:val="FunctionTok"/>
+        </w:rPr>
+        <w:t xml:space="preserve">,</w:t>
+      </w:r>
+      <w:r>
+        <w:rPr>
+          <w:rStyle w:val="NormalTok"/>
+        </w:rPr>
+        <w:t xml:space="preserve"> </w:t>
+      </w:r>
+      <w:r>
+        <w:rPr>
+          <w:rStyle w:val="DataTypeTok"/>
+        </w:rPr>
+        <w:t xml:space="preserve">"nameEn"</w:t>
+      </w:r>
+      <w:r>
+        <w:rPr>
+          <w:rStyle w:val="FunctionTok"/>
+        </w:rPr>
+        <w:t xml:space="preserve">,</w:t>
+      </w:r>
+      <w:r>
+        <w:rPr>
+          <w:rStyle w:val="NormalTok"/>
+        </w:rPr>
+        <w:t xml:space="preserve"> </w:t>
+      </w:r>
+      <w:r>
+        <w:rPr>
+          <w:rStyle w:val="DataTypeTok"/>
+        </w:rPr>
+        <w:t xml:space="preserve">"descriptionTr"</w:t>
+      </w:r>
+      <w:r>
+        <w:rPr>
+          <w:rStyle w:val="FunctionTok"/>
+        </w:rPr>
+        <w:t xml:space="preserve">,</w:t>
+      </w:r>
+      <w:r>
+        <w:rPr>
+          <w:rStyle w:val="NormalTok"/>
+        </w:rPr>
+        <w:t xml:space="preserve"> </w:t>
+      </w:r>
+      <w:r>
+        <w:rPr>
+          <w:rStyle w:val="DataTypeTok"/>
+        </w:rPr>
+        <w:t xml:space="preserve">"descriptionEn"</w:t>
+      </w:r>
+      <w:r>
+        <w:rPr>
+          <w:rStyle w:val="FunctionTok"/>
+        </w:rPr>
+        <w:t xml:space="preserve">,</w:t>
+      </w:r>
+      <w:r>
+        <w:br/>
+      </w:r>
+      <w:r>
+        <w:rPr>
+          <w:rStyle w:val="NormalTok"/>
+        </w:rPr>
+        <w:t xml:space="preserve">      </w:t>
+      </w:r>
+      <w:r>
+        <w:rPr>
+          <w:rStyle w:val="DataTypeTok"/>
+        </w:rPr>
+        <w:t xml:space="preserve">"iconUrl"</w:t>
+      </w:r>
+      <w:r>
+        <w:rPr>
+          <w:rStyle w:val="FunctionTok"/>
+        </w:rPr>
+        <w:t xml:space="preserve">,</w:t>
+      </w:r>
+      <w:r>
+        <w:rPr>
+          <w:rStyle w:val="NormalTok"/>
+        </w:rPr>
+        <w:t xml:space="preserve"> </w:t>
+      </w:r>
+      <w:r>
+        <w:rPr>
+          <w:rStyle w:val="DataTypeTok"/>
+        </w:rPr>
+        <w:t xml:space="preserve">"creditCost"</w:t>
+      </w:r>
+      <w:r>
+        <w:rPr>
+          <w:rStyle w:val="FunctionTok"/>
+        </w:rPr>
+        <w:t xml:space="preserve">,</w:t>
+      </w:r>
+      <w:r>
+        <w:rPr>
+          <w:rStyle w:val="NormalTok"/>
+        </w:rPr>
+        <w:t xml:space="preserve"> </w:t>
+      </w:r>
+      <w:r>
+        <w:rPr>
+          <w:rStyle w:val="DataTypeTok"/>
+        </w:rPr>
+        <w:t xml:space="preserve">"estimatedMinutes"</w:t>
+      </w:r>
+      <w:r>
+        <w:rPr>
+          <w:rStyle w:val="FunctionTok"/>
+        </w:rPr>
+        <w:t xml:space="preserve">,</w:t>
+      </w:r>
+      <w:r>
+        <w:rPr>
+          <w:rStyle w:val="NormalTok"/>
+        </w:rPr>
+        <w:t xml:space="preserve"> </w:t>
+      </w:r>
+      <w:r>
+        <w:rPr>
+          <w:rStyle w:val="DataTypeTok"/>
+        </w:rPr>
+        <w:t xml:space="preserve">"isActive"</w:t>
+      </w:r>
+      <w:r>
+        <w:rPr>
+          <w:rStyle w:val="FunctionTok"/>
+        </w:rPr>
+        <w:t xml:space="preserve">,</w:t>
+      </w:r>
+      <w:r>
+        <w:rPr>
+          <w:rStyle w:val="NormalTok"/>
+        </w:rPr>
+        <w:t xml:space="preserve"> </w:t>
+      </w:r>
+      <w:r>
+        <w:rPr>
+          <w:rStyle w:val="DataTypeTok"/>
+        </w:rPr>
+        <w:t xml:space="preserve">"sortOrder"</w:t>
+      </w:r>
+      <w:r>
+        <w:rPr>
+          <w:rStyle w:val="FunctionTok"/>
+        </w:rPr>
+        <w:t xml:space="preserve">,</w:t>
+      </w:r>
+      <w:r>
+        <w:br/>
+      </w:r>
+      <w:r>
+        <w:rPr>
+          <w:rStyle w:val="NormalTok"/>
+        </w:rPr>
+        <w:t xml:space="preserve">      </w:t>
+      </w:r>
+      <w:r>
+        <w:rPr>
+          <w:rStyle w:val="DataTypeTok"/>
+        </w:rPr>
+        <w:t xml:space="preserve">"requiredImages"</w:t>
+      </w:r>
+      <w:r>
+        <w:rPr>
+          <w:rStyle w:val="FunctionTok"/>
+        </w:rPr>
+        <w:t xml:space="preserve">,</w:t>
+      </w:r>
+      <w:r>
+        <w:rPr>
+          <w:rStyle w:val="NormalTok"/>
+        </w:rPr>
+        <w:t xml:space="preserve"> </w:t>
+      </w:r>
+      <w:r>
+        <w:rPr>
+          <w:rStyle w:val="DataTypeTok"/>
+        </w:rPr>
+        <w:t xml:space="preserve">"category"</w:t>
+      </w:r>
+      <w:r>
+        <w:br/>
+      </w:r>
+      <w:r>
+        <w:rPr>
+          <w:rStyle w:val="NormalTok"/>
+        </w:rPr>
+        <w:t xml:space="preserve">    </w:t>
+      </w:r>
+      <w:r>
+        <w:rPr>
+          <w:rStyle w:val="FunctionTok"/>
+        </w:rPr>
+        <w:t xml:space="preserve">}</w:t>
+      </w:r>
+      <w:r>
+        <w:rPr>
+          <w:rStyle w:val="OtherTok"/>
+        </w:rPr>
+        <w:t xml:space="preserve">]</w:t>
+      </w:r>
+      <w:r>
+        <w:rPr>
+          <w:rStyle w:val="FunctionTok"/>
+        </w:rPr>
+        <w:t xml:space="preserve">,</w:t>
+      </w:r>
+      <w:r>
+        <w:br/>
+      </w:r>
+      <w:r>
+        <w:rPr>
+          <w:rStyle w:val="NormalTok"/>
+        </w:rPr>
+        <w:t xml:space="preserve">    </w:t>
+      </w:r>
+      <w:r>
+        <w:rPr>
+          <w:rStyle w:val="DataTypeTok"/>
+        </w:rPr>
+        <w:t xml:space="preserve">"fortuneCards"</w:t>
+      </w:r>
+      <w:r>
+        <w:rPr>
+          <w:rStyle w:val="FunctionTok"/>
+        </w:rPr>
+        <w:t xml:space="preserve">:</w:t>
+      </w:r>
+      <w:r>
+        <w:rPr>
+          <w:rStyle w:val="NormalTok"/>
+        </w:rPr>
+        <w:t xml:space="preserve"> </w:t>
+      </w:r>
+      <w:r>
+        <w:rPr>
+          <w:rStyle w:val="OtherTok"/>
+        </w:rPr>
+        <w:t xml:space="preserve">[</w:t>
+      </w:r>
+      <w:r>
+        <w:rPr>
+          <w:rStyle w:val="FunctionTok"/>
+        </w:rPr>
+        <w:t xml:space="preserve">{</w:t>
+      </w:r>
+      <w:r>
+        <w:rPr>
+          <w:rStyle w:val="NormalTok"/>
+        </w:rPr>
+        <w:t xml:space="preserve"> </w:t>
+      </w:r>
+      <w:r>
+        <w:rPr>
+          <w:rStyle w:val="DataTypeTok"/>
+        </w:rPr>
+        <w:t xml:space="preserve">"id"</w:t>
+      </w:r>
+      <w:r>
+        <w:rPr>
+          <w:rStyle w:val="FunctionTok"/>
+        </w:rPr>
+        <w:t xml:space="preserve">,</w:t>
+      </w:r>
+      <w:r>
+        <w:rPr>
+          <w:rStyle w:val="NormalTok"/>
+        </w:rPr>
+        <w:t xml:space="preserve"> </w:t>
+      </w:r>
+      <w:r>
+        <w:rPr>
+          <w:rStyle w:val="DataTypeTok"/>
+        </w:rPr>
+        <w:t xml:space="preserve">"fortuneType"</w:t>
+      </w:r>
+      <w:r>
+        <w:rPr>
+          <w:rStyle w:val="FunctionTok"/>
+        </w:rPr>
+        <w:t xml:space="preserve">,</w:t>
+      </w:r>
+      <w:r>
+        <w:rPr>
+          <w:rStyle w:val="NormalTok"/>
+        </w:rPr>
+        <w:t xml:space="preserve"> </w:t>
+      </w:r>
+      <w:r>
+        <w:rPr>
+          <w:rStyle w:val="DataTypeTok"/>
+        </w:rPr>
+        <w:t xml:space="preserve">"title"</w:t>
+      </w:r>
+      <w:r>
+        <w:rPr>
+          <w:rStyle w:val="FunctionTok"/>
+        </w:rPr>
+        <w:t xml:space="preserve">,</w:t>
+      </w:r>
+      <w:r>
+        <w:rPr>
+          <w:rStyle w:val="NormalTok"/>
+        </w:rPr>
+        <w:t xml:space="preserve"> </w:t>
+      </w:r>
+      <w:r>
+        <w:rPr>
+          <w:rStyle w:val="DataTypeTok"/>
+        </w:rPr>
+        <w:t xml:space="preserve">"description"</w:t>
+      </w:r>
+      <w:r>
+        <w:rPr>
+          <w:rStyle w:val="FunctionTok"/>
+        </w:rPr>
+        <w:t xml:space="preserve">,</w:t>
+      </w:r>
+      <w:r>
+        <w:rPr>
+          <w:rStyle w:val="NormalTok"/>
+        </w:rPr>
+        <w:t xml:space="preserve"> </w:t>
+      </w:r>
+      <w:r>
+        <w:rPr>
+          <w:rStyle w:val="DataTypeTok"/>
+        </w:rPr>
+        <w:t xml:space="preserve">"iconUrl"</w:t>
+      </w:r>
+      <w:r>
+        <w:rPr>
+          <w:rStyle w:val="FunctionTok"/>
+        </w:rPr>
+        <w:t xml:space="preserve">,</w:t>
+      </w:r>
+      <w:r>
+        <w:rPr>
+          <w:rStyle w:val="NormalTok"/>
+        </w:rPr>
+        <w:t xml:space="preserve"> </w:t>
+      </w:r>
+      <w:r>
+        <w:rPr>
+          <w:rStyle w:val="DataTypeTok"/>
+        </w:rPr>
+        <w:t xml:space="preserve">"isActive"</w:t>
+      </w:r>
+      <w:r>
+        <w:rPr>
+          <w:rStyle w:val="NormalTok"/>
+        </w:rPr>
+        <w:t xml:space="preserve"> </w:t>
+      </w:r>
+      <w:r>
+        <w:rPr>
+          <w:rStyle w:val="FunctionTok"/>
+        </w:rPr>
+        <w:t xml:space="preserve">}</w:t>
+      </w:r>
+      <w:r>
+        <w:rPr>
+          <w:rStyle w:val="OtherTok"/>
+        </w:rPr>
+        <w:t xml:space="preserve">]</w:t>
+      </w:r>
+      <w:r>
+        <w:rPr>
+          <w:rStyle w:val="FunctionTok"/>
+        </w:rPr>
+        <w:t xml:space="preserve">,</w:t>
+      </w:r>
+      <w:r>
+        <w:br/>
+      </w:r>
+      <w:r>
+        <w:rPr>
+          <w:rStyle w:val="NormalTok"/>
+        </w:rPr>
+        <w:t xml:space="preserve">    </w:t>
+      </w:r>
+      <w:r>
+        <w:rPr>
+          <w:rStyle w:val="DataTypeTok"/>
+        </w:rPr>
+        <w:t xml:space="preserve">"userCredits"</w:t>
+      </w:r>
+      <w:r>
+        <w:rPr>
+          <w:rStyle w:val="FunctionTok"/>
+        </w:rPr>
+        <w:t xml:space="preserve">:</w:t>
+      </w:r>
+      <w:r>
+        <w:rPr>
+          <w:rStyle w:val="NormalTok"/>
+        </w:rPr>
+        <w:t xml:space="preserve"> </w:t>
+      </w:r>
+      <w:r>
+        <w:rPr>
+          <w:rStyle w:val="FunctionTok"/>
+        </w:rPr>
+        <w:t xml:space="preserve">{</w:t>
+      </w:r>
+      <w:r>
+        <w:rPr>
+          <w:rStyle w:val="NormalTok"/>
+        </w:rPr>
+        <w:t xml:space="preserve"> </w:t>
+      </w:r>
+      <w:r>
+        <w:rPr>
+          <w:rStyle w:val="DataTypeTok"/>
+        </w:rPr>
+        <w:t xml:space="preserve">"jetons"</w:t>
+      </w:r>
+      <w:r>
+        <w:rPr>
+          <w:rStyle w:val="FunctionTok"/>
+        </w:rPr>
+        <w:t xml:space="preserve">:</w:t>
+      </w:r>
+      <w:r>
+        <w:rPr>
+          <w:rStyle w:val="NormalTok"/>
+        </w:rPr>
+        <w:t xml:space="preserve"> </w:t>
+      </w:r>
+      <w:r>
+        <w:rPr>
+          <w:rStyle w:val="DecValTok"/>
+        </w:rPr>
+        <w:t xml:space="preserve">0</w:t>
+      </w:r>
+      <w:r>
+        <w:rPr>
+          <w:rStyle w:val="FunctionTok"/>
+        </w:rPr>
+        <w:t xml:space="preserve">,</w:t>
+      </w:r>
+      <w:r>
+        <w:rPr>
+          <w:rStyle w:val="NormalTok"/>
+        </w:rPr>
+        <w:t xml:space="preserve"> </w:t>
+      </w:r>
+      <w:r>
+        <w:rPr>
+          <w:rStyle w:val="DataTypeTok"/>
+        </w:rPr>
+        <w:t xml:space="preserve">"credits"</w:t>
+      </w:r>
+      <w:r>
+        <w:rPr>
+          <w:rStyle w:val="FunctionTok"/>
+        </w:rPr>
+        <w:t xml:space="preserve">:</w:t>
+      </w:r>
+      <w:r>
+        <w:rPr>
+          <w:rStyle w:val="NormalTok"/>
+        </w:rPr>
+        <w:t xml:space="preserve"> </w:t>
+      </w:r>
+      <w:r>
+        <w:rPr>
+          <w:rStyle w:val="DecValTok"/>
+        </w:rPr>
+        <w:t xml:space="preserve">0</w:t>
+      </w:r>
+      <w:r>
+        <w:rPr>
+          <w:rStyle w:val="NormalTok"/>
+        </w:rPr>
+        <w:t xml:space="preserve"> </w:t>
+      </w:r>
+      <w:r>
+        <w:rPr>
+          <w:rStyle w:val="FunctionTok"/>
+        </w:rPr>
+        <w:t xml:space="preserve">},</w:t>
+      </w:r>
+      <w:r>
+        <w:br/>
+      </w:r>
+      <w:r>
+        <w:rPr>
+          <w:rStyle w:val="NormalTok"/>
+        </w:rPr>
+        <w:t xml:space="preserve">    </w:t>
+      </w:r>
+      <w:r>
+        <w:rPr>
+          <w:rStyle w:val="DataTypeTok"/>
+        </w:rPr>
+        <w:t xml:space="preserve">"creditsPerMinute"</w:t>
+      </w:r>
+      <w:r>
+        <w:rPr>
+          <w:rStyle w:val="FunctionTok"/>
+        </w:rPr>
+        <w:t xml:space="preserve">:</w:t>
+      </w:r>
+      <w:r>
+        <w:rPr>
+          <w:rStyle w:val="NormalTok"/>
+        </w:rPr>
+        <w:t xml:space="preserve"> </w:t>
+      </w:r>
+      <w:r>
+        <w:rPr>
+          <w:rStyle w:val="DecValTok"/>
+        </w:rPr>
+        <w:t xml:space="preserve">1</w:t>
+      </w:r>
+      <w:r>
+        <w:br/>
+      </w:r>
+      <w:r>
+        <w:rPr>
+          <w:rStyle w:val="NormalTok"/>
+        </w:rPr>
+        <w:t xml:space="preserve">  </w:t>
+      </w:r>
+      <w:r>
+        <w:rPr>
+          <w:rStyle w:val="FunctionTok"/>
+        </w:rPr>
+        <w:t xml:space="preserve">}</w:t>
+      </w:r>
+      <w:r>
+        <w:br/>
+      </w:r>
+      <w:r>
+        <w:rPr>
+          <w:rStyle w:val="FunctionTok"/>
+        </w:rPr>
+        <w:t xml:space="preserve">}</w:t>
+      </w:r>
+    </w:p>
+    <w:p>
+      <w:r>
+        <w:pict>
+          <v:rect style="width:0;height:1.5pt" o:hralign="center" o:hrstd="t" o:hr="t"/>
+        </w:pict>
+      </w:r>
+    </w:p>
+    <w:bookmarkEnd w:id="51"/>
+    <w:bookmarkStart w:id="52" w:name="get-apimobileuser-profileuserid"/>
+    <w:p>
+      <w:pPr>
+        <w:pStyle w:val="Heading3"/>
+      </w:pPr>
+      <w:r>
+        <w:t xml:space="preserve">GET /api/mobile/user-profile/{userId}</w:t>
+      </w:r>
+    </w:p>
+    <w:p>
+      <w:pPr>
+        <w:pStyle w:val="FirstParagraph"/>
+      </w:pPr>
+      <w:r>
+        <w:t xml:space="preserve">Kullanıcı profili — profil bilgisi, istatistikler, takip/engel durumu, başarılar.</w:t>
+      </w:r>
+    </w:p>
+    <w:p>
+      <w:pPr>
+        <w:pStyle w:val="BodyText"/>
+      </w:pPr>
+      <w:r>
+        <w:rPr>
+          <w:bCs/>
+          <w:b/>
+        </w:rPr>
+        <w:t xml:space="preserve">Auth:</w:t>
+      </w:r>
+      <w:r>
+        <w:t xml:space="preserve"> </w:t>
+      </w:r>
+      <w:r>
+        <w:rPr>
+          <w:rStyle w:val="VerbatimChar"/>
+        </w:rPr>
+        <w:t xml:space="preserve">Authorization: Bearer &lt;jwt&gt;</w:t>
+      </w:r>
+      <w:r>
+        <w:t xml:space="preserve"> </w:t>
+      </w:r>
+      <w:r>
+        <w:t xml:space="preserve">(zorunlu)</w:t>
+      </w:r>
+    </w:p>
+    <w:p>
+      <w:pPr>
+        <w:pStyle w:val="BodyText"/>
+      </w:pPr>
+      <w:r>
+        <w:rPr>
+          <w:bCs/>
+          <w:b/>
+        </w:rPr>
+        <w:t xml:space="preserve">Response:</w:t>
+      </w:r>
+    </w:p>
+    <w:p>
+      <w:pPr>
+        <w:pStyle w:val="SourceCode"/>
+      </w:pPr>
+      <w:r>
+        <w:rPr>
+          <w:rStyle w:val="FunctionTok"/>
+        </w:rPr>
+        <w:t xml:space="preserve">{</w:t>
+      </w:r>
+      <w:r>
+        <w:br/>
+      </w:r>
+      <w:r>
+        <w:rPr>
+          <w:rStyle w:val="NormalTok"/>
+        </w:rPr>
+        <w:t xml:space="preserve">  </w:t>
+      </w:r>
+      <w:r>
+        <w:rPr>
+          <w:rStyle w:val="DataTypeTok"/>
+        </w:rPr>
+        <w:t xml:space="preserve">"success"</w:t>
+      </w:r>
+      <w:r>
+        <w:rPr>
+          <w:rStyle w:val="FunctionTok"/>
+        </w:rPr>
+        <w:t xml:space="preserve">:</w:t>
+      </w:r>
+      <w:r>
+        <w:rPr>
+          <w:rStyle w:val="NormalTok"/>
+        </w:rPr>
+        <w:t xml:space="preserve"> </w:t>
+      </w:r>
+      <w:r>
+        <w:rPr>
+          <w:rStyle w:val="KeywordTok"/>
+        </w:rPr>
+        <w:t xml:space="preserve">true</w:t>
+      </w:r>
+      <w:r>
+        <w:rPr>
+          <w:rStyle w:val="FunctionTok"/>
+        </w:rPr>
+        <w:t xml:space="preserve">,</w:t>
+      </w:r>
+      <w:r>
+        <w:br/>
+      </w:r>
+      <w:r>
+        <w:rPr>
+          <w:rStyle w:val="NormalTok"/>
+        </w:rPr>
+        <w:t xml:space="preserve">  </w:t>
+      </w:r>
+      <w:r>
+        <w:rPr>
+          <w:rStyle w:val="DataTypeTok"/>
+        </w:rPr>
+        <w:t xml:space="preserve">"data"</w:t>
+      </w:r>
+      <w:r>
+        <w:rPr>
+          <w:rStyle w:val="FunctionTok"/>
+        </w:rPr>
+        <w:t xml:space="preserve">:</w:t>
+      </w:r>
+      <w:r>
+        <w:rPr>
+          <w:rStyle w:val="NormalTok"/>
+        </w:rPr>
+        <w:t xml:space="preserve"> </w:t>
+      </w:r>
+      <w:r>
+        <w:rPr>
+          <w:rStyle w:val="FunctionTok"/>
+        </w:rPr>
+        <w:t xml:space="preserve">{</w:t>
+      </w:r>
+      <w:r>
+        <w:br/>
+      </w:r>
+      <w:r>
+        <w:rPr>
+          <w:rStyle w:val="NormalTok"/>
+        </w:rPr>
+        <w:t xml:space="preserve">    </w:t>
+      </w:r>
+      <w:r>
+        <w:rPr>
+          <w:rStyle w:val="DataTypeTok"/>
+        </w:rPr>
+        <w:t xml:space="preserve">"user"</w:t>
+      </w:r>
+      <w:r>
+        <w:rPr>
+          <w:rStyle w:val="FunctionTok"/>
+        </w:rPr>
+        <w:t xml:space="preserve">:</w:t>
+      </w:r>
+      <w:r>
+        <w:rPr>
+          <w:rStyle w:val="NormalTok"/>
+        </w:rPr>
+        <w:t xml:space="preserve"> </w:t>
+      </w:r>
+      <w:r>
+        <w:rPr>
+          <w:rStyle w:val="FunctionTok"/>
+        </w:rPr>
+        <w:t xml:space="preserve">{</w:t>
+      </w:r>
+      <w:r>
+        <w:br/>
+      </w:r>
+      <w:r>
+        <w:rPr>
+          <w:rStyle w:val="NormalTok"/>
+        </w:rPr>
+        <w:t xml:space="preserve">      </w:t>
+      </w:r>
+      <w:r>
+        <w:rPr>
+          <w:rStyle w:val="DataTypeTok"/>
+        </w:rPr>
+        <w:t xml:space="preserve">"id"</w:t>
+      </w:r>
+      <w:r>
+        <w:rPr>
+          <w:rStyle w:val="FunctionTok"/>
+        </w:rPr>
+        <w:t xml:space="preserve">,</w:t>
+      </w:r>
+      <w:r>
+        <w:rPr>
+          <w:rStyle w:val="NormalTok"/>
+        </w:rPr>
+        <w:t xml:space="preserve"> </w:t>
+      </w:r>
+      <w:r>
+        <w:rPr>
+          <w:rStyle w:val="DataTypeTok"/>
+        </w:rPr>
+        <w:t xml:space="preserve">"name"</w:t>
+      </w:r>
+      <w:r>
+        <w:rPr>
+          <w:rStyle w:val="FunctionTok"/>
+        </w:rPr>
+        <w:t xml:space="preserve">,</w:t>
+      </w:r>
+      <w:r>
+        <w:rPr>
+          <w:rStyle w:val="NormalTok"/>
+        </w:rPr>
+        <w:t xml:space="preserve"> </w:t>
+      </w:r>
+      <w:r>
+        <w:rPr>
+          <w:rStyle w:val="DataTypeTok"/>
+        </w:rPr>
+        <w:t xml:space="preserve">"profileImageUrl"</w:t>
+      </w:r>
+      <w:r>
+        <w:rPr>
+          <w:rStyle w:val="FunctionTok"/>
+        </w:rPr>
+        <w:t xml:space="preserve">,</w:t>
+      </w:r>
+      <w:r>
+        <w:rPr>
+          <w:rStyle w:val="NormalTok"/>
+        </w:rPr>
+        <w:t xml:space="preserve"> </w:t>
+      </w:r>
+      <w:r>
+        <w:rPr>
+          <w:rStyle w:val="DataTypeTok"/>
+        </w:rPr>
+        <w:t xml:space="preserve">"bio"</w:t>
+      </w:r>
+      <w:r>
+        <w:rPr>
+          <w:rStyle w:val="FunctionTok"/>
+        </w:rPr>
+        <w:t xml:space="preserve">,</w:t>
+      </w:r>
+      <w:r>
+        <w:rPr>
+          <w:rStyle w:val="NormalTok"/>
+        </w:rPr>
+        <w:t xml:space="preserve"> </w:t>
+      </w:r>
+      <w:r>
+        <w:rPr>
+          <w:rStyle w:val="DataTypeTok"/>
+        </w:rPr>
+        <w:t xml:space="preserve">"gender"</w:t>
+      </w:r>
+      <w:r>
+        <w:rPr>
+          <w:rStyle w:val="FunctionTok"/>
+        </w:rPr>
+        <w:t xml:space="preserve">,</w:t>
+      </w:r>
+      <w:r>
+        <w:rPr>
+          <w:rStyle w:val="NormalTok"/>
+        </w:rPr>
+        <w:t xml:space="preserve"> </w:t>
+      </w:r>
+      <w:r>
+        <w:rPr>
+          <w:rStyle w:val="DataTypeTok"/>
+        </w:rPr>
+        <w:t xml:space="preserve">"birthDate"</w:t>
+      </w:r>
+      <w:r>
+        <w:rPr>
+          <w:rStyle w:val="FunctionTok"/>
+        </w:rPr>
+        <w:t xml:space="preserve">,</w:t>
+      </w:r>
+      <w:r>
+        <w:br/>
+      </w:r>
+      <w:r>
+        <w:rPr>
+          <w:rStyle w:val="NormalTok"/>
+        </w:rPr>
+        <w:t xml:space="preserve">      </w:t>
+      </w:r>
+      <w:r>
+        <w:rPr>
+          <w:rStyle w:val="DataTypeTok"/>
+        </w:rPr>
+        <w:t xml:space="preserve">"level"</w:t>
+      </w:r>
+      <w:r>
+        <w:rPr>
+          <w:rStyle w:val="FunctionTok"/>
+        </w:rPr>
+        <w:t xml:space="preserve">,</w:t>
+      </w:r>
+      <w:r>
+        <w:rPr>
+          <w:rStyle w:val="NormalTok"/>
+        </w:rPr>
+        <w:t xml:space="preserve"> </w:t>
+      </w:r>
+      <w:r>
+        <w:rPr>
+          <w:rStyle w:val="DataTypeTok"/>
+        </w:rPr>
+        <w:t xml:space="preserve">"xp"</w:t>
+      </w:r>
+      <w:r>
+        <w:rPr>
+          <w:rStyle w:val="FunctionTok"/>
+        </w:rPr>
+        <w:t xml:space="preserve">,</w:t>
+      </w:r>
+      <w:r>
+        <w:rPr>
+          <w:rStyle w:val="NormalTok"/>
+        </w:rPr>
+        <w:t xml:space="preserve"> </w:t>
+      </w:r>
+      <w:r>
+        <w:rPr>
+          <w:rStyle w:val="DataTypeTok"/>
+        </w:rPr>
+        <w:t xml:space="preserve">"zodiacSign"</w:t>
+      </w:r>
+      <w:r>
+        <w:rPr>
+          <w:rStyle w:val="FunctionTok"/>
+        </w:rPr>
+        <w:t xml:space="preserve">,</w:t>
+      </w:r>
+      <w:r>
+        <w:rPr>
+          <w:rStyle w:val="NormalTok"/>
+        </w:rPr>
+        <w:t xml:space="preserve"> </w:t>
+      </w:r>
+      <w:r>
+        <w:rPr>
+          <w:rStyle w:val="DataTypeTok"/>
+        </w:rPr>
+        <w:t xml:space="preserve">"isOnline"</w:t>
+      </w:r>
+      <w:r>
+        <w:rPr>
+          <w:rStyle w:val="FunctionTok"/>
+        </w:rPr>
+        <w:t xml:space="preserve">,</w:t>
+      </w:r>
+      <w:r>
+        <w:rPr>
+          <w:rStyle w:val="NormalTok"/>
+        </w:rPr>
+        <w:t xml:space="preserve"> </w:t>
+      </w:r>
+      <w:r>
+        <w:rPr>
+          <w:rStyle w:val="DataTypeTok"/>
+        </w:rPr>
+        <w:t xml:space="preserve">"lastSeen"</w:t>
+      </w:r>
+      <w:r>
+        <w:rPr>
+          <w:rStyle w:val="FunctionTok"/>
+        </w:rPr>
+        <w:t xml:space="preserve">,</w:t>
+      </w:r>
+      <w:r>
+        <w:rPr>
+          <w:rStyle w:val="NormalTok"/>
+        </w:rPr>
+        <w:t xml:space="preserve"> </w:t>
+      </w:r>
+      <w:r>
+        <w:rPr>
+          <w:rStyle w:val="DataTypeTok"/>
+        </w:rPr>
+        <w:t xml:space="preserve">"role"</w:t>
+      </w:r>
+      <w:r>
+        <w:rPr>
+          <w:rStyle w:val="FunctionTok"/>
+        </w:rPr>
+        <w:t xml:space="preserve">,</w:t>
+      </w:r>
+      <w:r>
+        <w:br/>
+      </w:r>
+      <w:r>
+        <w:rPr>
+          <w:rStyle w:val="NormalTok"/>
+        </w:rPr>
+        <w:t xml:space="preserve">      </w:t>
+      </w:r>
+      <w:r>
+        <w:rPr>
+          <w:rStyle w:val="DataTypeTok"/>
+        </w:rPr>
+        <w:t xml:space="preserve">"badges"</w:t>
+      </w:r>
+      <w:r>
+        <w:rPr>
+          <w:rStyle w:val="FunctionTok"/>
+        </w:rPr>
+        <w:t xml:space="preserve">:</w:t>
+      </w:r>
+      <w:r>
+        <w:rPr>
+          <w:rStyle w:val="NormalTok"/>
+        </w:rPr>
+        <w:t xml:space="preserve"> </w:t>
+      </w:r>
+      <w:r>
+        <w:rPr>
+          <w:rStyle w:val="OtherTok"/>
+        </w:rPr>
+        <w:t xml:space="preserve">[</w:t>
+      </w:r>
+      <w:r>
+        <w:rPr>
+          <w:rStyle w:val="FunctionTok"/>
+        </w:rPr>
+        <w:t xml:space="preserve">{</w:t>
+      </w:r>
+      <w:r>
+        <w:rPr>
+          <w:rStyle w:val="NormalTok"/>
+        </w:rPr>
+        <w:t xml:space="preserve"> </w:t>
+      </w:r>
+      <w:r>
+        <w:rPr>
+          <w:rStyle w:val="DataTypeTok"/>
+        </w:rPr>
+        <w:t xml:space="preserve">"id"</w:t>
+      </w:r>
+      <w:r>
+        <w:rPr>
+          <w:rStyle w:val="FunctionTok"/>
+        </w:rPr>
+        <w:t xml:space="preserve">,</w:t>
+      </w:r>
+      <w:r>
+        <w:rPr>
+          <w:rStyle w:val="NormalTok"/>
+        </w:rPr>
+        <w:t xml:space="preserve"> </w:t>
+      </w:r>
+      <w:r>
+        <w:rPr>
+          <w:rStyle w:val="DataTypeTok"/>
+        </w:rPr>
+        <w:t xml:space="preserve">"badgeId"</w:t>
+      </w:r>
+      <w:r>
+        <w:rPr>
+          <w:rStyle w:val="FunctionTok"/>
+        </w:rPr>
+        <w:t xml:space="preserve">,</w:t>
+      </w:r>
+      <w:r>
+        <w:rPr>
+          <w:rStyle w:val="NormalTok"/>
+        </w:rPr>
+        <w:t xml:space="preserve"> </w:t>
+      </w:r>
+      <w:r>
+        <w:rPr>
+          <w:rStyle w:val="DataTypeTok"/>
+        </w:rPr>
+        <w:t xml:space="preserve">"earnedAt"</w:t>
+      </w:r>
+      <w:r>
+        <w:rPr>
+          <w:rStyle w:val="FunctionTok"/>
+        </w:rPr>
+        <w:t xml:space="preserve">,</w:t>
+      </w:r>
+      <w:r>
+        <w:rPr>
+          <w:rStyle w:val="NormalTok"/>
+        </w:rPr>
+        <w:t xml:space="preserve"> </w:t>
+      </w:r>
+      <w:r>
+        <w:rPr>
+          <w:rStyle w:val="DataTypeTok"/>
+        </w:rPr>
+        <w:t xml:space="preserve">"badge"</w:t>
+      </w:r>
+      <w:r>
+        <w:rPr>
+          <w:rStyle w:val="FunctionTok"/>
+        </w:rPr>
+        <w:t xml:space="preserve">:</w:t>
+      </w:r>
+      <w:r>
+        <w:rPr>
+          <w:rStyle w:val="NormalTok"/>
+        </w:rPr>
+        <w:t xml:space="preserve"> </w:t>
+      </w:r>
+      <w:r>
+        <w:rPr>
+          <w:rStyle w:val="FunctionTok"/>
+        </w:rPr>
+        <w:t xml:space="preserve">{</w:t>
+      </w:r>
+      <w:r>
+        <w:rPr>
+          <w:rStyle w:val="NormalTok"/>
+        </w:rPr>
+        <w:t xml:space="preserve"> </w:t>
+      </w:r>
+      <w:r>
+        <w:rPr>
+          <w:rStyle w:val="DataTypeTok"/>
+        </w:rPr>
+        <w:t xml:space="preserve">"nameTr"</w:t>
+      </w:r>
+      <w:r>
+        <w:rPr>
+          <w:rStyle w:val="FunctionTok"/>
+        </w:rPr>
+        <w:t xml:space="preserve">,</w:t>
+      </w:r>
+      <w:r>
+        <w:rPr>
+          <w:rStyle w:val="NormalTok"/>
+        </w:rPr>
+        <w:t xml:space="preserve"> </w:t>
+      </w:r>
+      <w:r>
+        <w:rPr>
+          <w:rStyle w:val="DataTypeTok"/>
+        </w:rPr>
+        <w:t xml:space="preserve">"nameEn"</w:t>
+      </w:r>
+      <w:r>
+        <w:rPr>
+          <w:rStyle w:val="FunctionTok"/>
+        </w:rPr>
+        <w:t xml:space="preserve">,</w:t>
+      </w:r>
+      <w:r>
+        <w:rPr>
+          <w:rStyle w:val="NormalTok"/>
+        </w:rPr>
+        <w:t xml:space="preserve"> </w:t>
+      </w:r>
+      <w:r>
+        <w:rPr>
+          <w:rStyle w:val="DataTypeTok"/>
+        </w:rPr>
+        <w:t xml:space="preserve">"iconUrl"</w:t>
+      </w:r>
+      <w:r>
+        <w:rPr>
+          <w:rStyle w:val="NormalTok"/>
+        </w:rPr>
+        <w:t xml:space="preserve"> </w:t>
+      </w:r>
+      <w:r>
+        <w:rPr>
+          <w:rStyle w:val="FunctionTok"/>
+        </w:rPr>
+        <w:t xml:space="preserve">}</w:t>
+      </w:r>
+      <w:r>
+        <w:rPr>
+          <w:rStyle w:val="NormalTok"/>
+        </w:rPr>
+        <w:t xml:space="preserve"> </w:t>
+      </w:r>
+      <w:r>
+        <w:rPr>
+          <w:rStyle w:val="FunctionTok"/>
+        </w:rPr>
+        <w:t xml:space="preserve">}</w:t>
+      </w:r>
+      <w:r>
+        <w:rPr>
+          <w:rStyle w:val="OtherTok"/>
+        </w:rPr>
+        <w:t xml:space="preserve">]</w:t>
+      </w:r>
+      <w:r>
+        <w:br/>
+      </w:r>
+      <w:r>
+        <w:rPr>
+          <w:rStyle w:val="NormalTok"/>
+        </w:rPr>
+        <w:t xml:space="preserve">    </w:t>
+      </w:r>
+      <w:r>
+        <w:rPr>
+          <w:rStyle w:val="FunctionTok"/>
+        </w:rPr>
+        <w:t xml:space="preserve">},</w:t>
+      </w:r>
+      <w:r>
+        <w:br/>
+      </w:r>
+      <w:r>
+        <w:rPr>
+          <w:rStyle w:val="NormalTok"/>
+        </w:rPr>
+        <w:t xml:space="preserve">    </w:t>
+      </w:r>
+      <w:r>
+        <w:rPr>
+          <w:rStyle w:val="DataTypeTok"/>
+        </w:rPr>
+        <w:t xml:space="preserve">"stats"</w:t>
+      </w:r>
+      <w:r>
+        <w:rPr>
+          <w:rStyle w:val="FunctionTok"/>
+        </w:rPr>
+        <w:t xml:space="preserve">:</w:t>
+      </w:r>
+      <w:r>
+        <w:rPr>
+          <w:rStyle w:val="NormalTok"/>
+        </w:rPr>
+        <w:t xml:space="preserve"> </w:t>
+      </w:r>
+      <w:r>
+        <w:rPr>
+          <w:rStyle w:val="FunctionTok"/>
+        </w:rPr>
+        <w:t xml:space="preserve">{</w:t>
+      </w:r>
+      <w:r>
+        <w:br/>
+      </w:r>
+      <w:r>
+        <w:rPr>
+          <w:rStyle w:val="NormalTok"/>
+        </w:rPr>
+        <w:t xml:space="preserve">      </w:t>
+      </w:r>
+      <w:r>
+        <w:rPr>
+          <w:rStyle w:val="DataTypeTok"/>
+        </w:rPr>
+        <w:t xml:space="preserve">"followerCount"</w:t>
+      </w:r>
+      <w:r>
+        <w:rPr>
+          <w:rStyle w:val="FunctionTok"/>
+        </w:rPr>
+        <w:t xml:space="preserve">:</w:t>
+      </w:r>
+      <w:r>
+        <w:rPr>
+          <w:rStyle w:val="NormalTok"/>
+        </w:rPr>
+        <w:t xml:space="preserve"> </w:t>
+      </w:r>
+      <w:r>
+        <w:rPr>
+          <w:rStyle w:val="DecValTok"/>
+        </w:rPr>
+        <w:t xml:space="preserve">0</w:t>
+      </w:r>
+      <w:r>
+        <w:rPr>
+          <w:rStyle w:val="FunctionTok"/>
+        </w:rPr>
+        <w:t xml:space="preserve">,</w:t>
+      </w:r>
+      <w:r>
+        <w:rPr>
+          <w:rStyle w:val="NormalTok"/>
+        </w:rPr>
+        <w:t xml:space="preserve"> </w:t>
+      </w:r>
+      <w:r>
+        <w:rPr>
+          <w:rStyle w:val="DataTypeTok"/>
+        </w:rPr>
+        <w:t xml:space="preserve">"followingCount"</w:t>
+      </w:r>
+      <w:r>
+        <w:rPr>
+          <w:rStyle w:val="FunctionTok"/>
+        </w:rPr>
+        <w:t xml:space="preserve">:</w:t>
+      </w:r>
+      <w:r>
+        <w:rPr>
+          <w:rStyle w:val="NormalTok"/>
+        </w:rPr>
+        <w:t xml:space="preserve"> </w:t>
+      </w:r>
+      <w:r>
+        <w:rPr>
+          <w:rStyle w:val="DecValTok"/>
+        </w:rPr>
+        <w:t xml:space="preserve">0</w:t>
+      </w:r>
+      <w:r>
+        <w:rPr>
+          <w:rStyle w:val="FunctionTok"/>
+        </w:rPr>
+        <w:t xml:space="preserve">,</w:t>
+      </w:r>
+      <w:r>
+        <w:rPr>
+          <w:rStyle w:val="NormalTok"/>
+        </w:rPr>
+        <w:t xml:space="preserve"> </w:t>
+      </w:r>
+      <w:r>
+        <w:rPr>
+          <w:rStyle w:val="DataTypeTok"/>
+        </w:rPr>
+        <w:t xml:space="preserve">"totalFortunesReceived"</w:t>
+      </w:r>
+      <w:r>
+        <w:rPr>
+          <w:rStyle w:val="FunctionTok"/>
+        </w:rPr>
+        <w:t xml:space="preserve">:</w:t>
+      </w:r>
+      <w:r>
+        <w:rPr>
+          <w:rStyle w:val="NormalTok"/>
+        </w:rPr>
+        <w:t xml:space="preserve"> </w:t>
+      </w:r>
+      <w:r>
+        <w:rPr>
+          <w:rStyle w:val="DecValTok"/>
+        </w:rPr>
+        <w:t xml:space="preserve">0</w:t>
+      </w:r>
+      <w:r>
+        <w:rPr>
+          <w:rStyle w:val="FunctionTok"/>
+        </w:rPr>
+        <w:t xml:space="preserve">,</w:t>
+      </w:r>
+      <w:r>
+        <w:br/>
+      </w:r>
+      <w:r>
+        <w:rPr>
+          <w:rStyle w:val="NormalTok"/>
+        </w:rPr>
+        <w:t xml:space="preserve">      </w:t>
+      </w:r>
+      <w:r>
+        <w:rPr>
+          <w:rStyle w:val="DataTypeTok"/>
+        </w:rPr>
+        <w:t xml:space="preserve">"totalGiftsSent"</w:t>
+      </w:r>
+      <w:r>
+        <w:rPr>
+          <w:rStyle w:val="FunctionTok"/>
+        </w:rPr>
+        <w:t xml:space="preserve">:</w:t>
+      </w:r>
+      <w:r>
+        <w:rPr>
+          <w:rStyle w:val="NormalTok"/>
+        </w:rPr>
+        <w:t xml:space="preserve"> </w:t>
+      </w:r>
+      <w:r>
+        <w:rPr>
+          <w:rStyle w:val="DecValTok"/>
+        </w:rPr>
+        <w:t xml:space="preserve">0</w:t>
+      </w:r>
+      <w:r>
+        <w:rPr>
+          <w:rStyle w:val="FunctionTok"/>
+        </w:rPr>
+        <w:t xml:space="preserve">,</w:t>
+      </w:r>
+      <w:r>
+        <w:rPr>
+          <w:rStyle w:val="NormalTok"/>
+        </w:rPr>
+        <w:t xml:space="preserve"> </w:t>
+      </w:r>
+      <w:r>
+        <w:rPr>
+          <w:rStyle w:val="DataTypeTok"/>
+        </w:rPr>
+        <w:t xml:space="preserve">"totalGiftsReceived"</w:t>
+      </w:r>
+      <w:r>
+        <w:rPr>
+          <w:rStyle w:val="FunctionTok"/>
+        </w:rPr>
+        <w:t xml:space="preserve">:</w:t>
+      </w:r>
+      <w:r>
+        <w:rPr>
+          <w:rStyle w:val="NormalTok"/>
+        </w:rPr>
+        <w:t xml:space="preserve"> </w:t>
+      </w:r>
+      <w:r>
+        <w:rPr>
+          <w:rStyle w:val="DecValTok"/>
+        </w:rPr>
+        <w:t xml:space="preserve">0</w:t>
+      </w:r>
+      <w:r>
+        <w:rPr>
+          <w:rStyle w:val="FunctionTok"/>
+        </w:rPr>
+        <w:t xml:space="preserve">,</w:t>
+      </w:r>
+      <w:r>
+        <w:br/>
+      </w:r>
+      <w:r>
+        <w:rPr>
+          <w:rStyle w:val="NormalTok"/>
+        </w:rPr>
+        <w:t xml:space="preserve">      </w:t>
+      </w:r>
+      <w:r>
+        <w:rPr>
+          <w:rStyle w:val="DataTypeTok"/>
+        </w:rPr>
+        <w:t xml:space="preserve">"shortVideoCount"</w:t>
+      </w:r>
+      <w:r>
+        <w:rPr>
+          <w:rStyle w:val="FunctionTok"/>
+        </w:rPr>
+        <w:t xml:space="preserve">:</w:t>
+      </w:r>
+      <w:r>
+        <w:rPr>
+          <w:rStyle w:val="NormalTok"/>
+        </w:rPr>
+        <w:t xml:space="preserve"> </w:t>
+      </w:r>
+      <w:r>
+        <w:rPr>
+          <w:rStyle w:val="DecValTok"/>
+        </w:rPr>
+        <w:t xml:space="preserve">0</w:t>
+      </w:r>
+      <w:r>
+        <w:rPr>
+          <w:rStyle w:val="FunctionTok"/>
+        </w:rPr>
+        <w:t xml:space="preserve">,</w:t>
+      </w:r>
+      <w:r>
+        <w:rPr>
+          <w:rStyle w:val="NormalTok"/>
+        </w:rPr>
+        <w:t xml:space="preserve"> </w:t>
+      </w:r>
+      <w:r>
+        <w:rPr>
+          <w:rStyle w:val="DataTypeTok"/>
+        </w:rPr>
+        <w:t xml:space="preserve">"postCount"</w:t>
+      </w:r>
+      <w:r>
+        <w:rPr>
+          <w:rStyle w:val="FunctionTok"/>
+        </w:rPr>
+        <w:t xml:space="preserve">:</w:t>
+      </w:r>
+      <w:r>
+        <w:rPr>
+          <w:rStyle w:val="NormalTok"/>
+        </w:rPr>
+        <w:t xml:space="preserve"> </w:t>
+      </w:r>
+      <w:r>
+        <w:rPr>
+          <w:rStyle w:val="DecValTok"/>
+        </w:rPr>
+        <w:t xml:space="preserve">0</w:t>
+      </w:r>
+      <w:r>
+        <w:br/>
+      </w:r>
+      <w:r>
+        <w:rPr>
+          <w:rStyle w:val="NormalTok"/>
+        </w:rPr>
+        <w:t xml:space="preserve">    </w:t>
+      </w:r>
+      <w:r>
+        <w:rPr>
+          <w:rStyle w:val="FunctionTok"/>
+        </w:rPr>
+        <w:t xml:space="preserve">},</w:t>
+      </w:r>
+      <w:r>
+        <w:br/>
+      </w:r>
+      <w:r>
+        <w:rPr>
+          <w:rStyle w:val="NormalTok"/>
+        </w:rPr>
+        <w:t xml:space="preserve">    </w:t>
+      </w:r>
+      <w:r>
+        <w:rPr>
+          <w:rStyle w:val="DataTypeTok"/>
+        </w:rPr>
+        <w:t xml:space="preserve">"relationship"</w:t>
+      </w:r>
+      <w:r>
+        <w:rPr>
+          <w:rStyle w:val="FunctionTok"/>
+        </w:rPr>
+        <w:t xml:space="preserve">:</w:t>
+      </w:r>
+      <w:r>
+        <w:rPr>
+          <w:rStyle w:val="NormalTok"/>
+        </w:rPr>
+        <w:t xml:space="preserve"> </w:t>
+      </w:r>
+      <w:r>
+        <w:rPr>
+          <w:rStyle w:val="FunctionTok"/>
+        </w:rPr>
+        <w:t xml:space="preserve">{</w:t>
+      </w:r>
+      <w:r>
+        <w:br/>
+      </w:r>
+      <w:r>
+        <w:rPr>
+          <w:rStyle w:val="NormalTok"/>
+        </w:rPr>
+        <w:t xml:space="preserve">      </w:t>
+      </w:r>
+      <w:r>
+        <w:rPr>
+          <w:rStyle w:val="DataTypeTok"/>
+        </w:rPr>
+        <w:t xml:space="preserve">"isFollowing"</w:t>
+      </w:r>
+      <w:r>
+        <w:rPr>
+          <w:rStyle w:val="FunctionTok"/>
+        </w:rPr>
+        <w:t xml:space="preserve">:</w:t>
+      </w:r>
+      <w:r>
+        <w:rPr>
+          <w:rStyle w:val="NormalTok"/>
+        </w:rPr>
+        <w:t xml:space="preserve"> </w:t>
+      </w:r>
+      <w:r>
+        <w:rPr>
+          <w:rStyle w:val="KeywordTok"/>
+        </w:rPr>
+        <w:t xml:space="preserve">false</w:t>
+      </w:r>
+      <w:r>
+        <w:rPr>
+          <w:rStyle w:val="FunctionTok"/>
+        </w:rPr>
+        <w:t xml:space="preserve">,</w:t>
+      </w:r>
+      <w:r>
+        <w:rPr>
+          <w:rStyle w:val="NormalTok"/>
+        </w:rPr>
+        <w:t xml:space="preserve"> </w:t>
+      </w:r>
+      <w:r>
+        <w:rPr>
+          <w:rStyle w:val="DataTypeTok"/>
+        </w:rPr>
+        <w:t xml:space="preserve">"isFollowedBy"</w:t>
+      </w:r>
+      <w:r>
+        <w:rPr>
+          <w:rStyle w:val="FunctionTok"/>
+        </w:rPr>
+        <w:t xml:space="preserve">:</w:t>
+      </w:r>
+      <w:r>
+        <w:rPr>
+          <w:rStyle w:val="NormalTok"/>
+        </w:rPr>
+        <w:t xml:space="preserve"> </w:t>
+      </w:r>
+      <w:r>
+        <w:rPr>
+          <w:rStyle w:val="KeywordTok"/>
+        </w:rPr>
+        <w:t xml:space="preserve">false</w:t>
+      </w:r>
+      <w:r>
+        <w:rPr>
+          <w:rStyle w:val="FunctionTok"/>
+        </w:rPr>
+        <w:t xml:space="preserve">,</w:t>
+      </w:r>
+      <w:r>
+        <w:rPr>
+          <w:rStyle w:val="NormalTok"/>
+        </w:rPr>
+        <w:t xml:space="preserve"> </w:t>
+      </w:r>
+      <w:r>
+        <w:rPr>
+          <w:rStyle w:val="DataTypeTok"/>
+        </w:rPr>
+        <w:t xml:space="preserve">"isBlocked"</w:t>
+      </w:r>
+      <w:r>
+        <w:rPr>
+          <w:rStyle w:val="FunctionTok"/>
+        </w:rPr>
+        <w:t xml:space="preserve">:</w:t>
+      </w:r>
+      <w:r>
+        <w:rPr>
+          <w:rStyle w:val="NormalTok"/>
+        </w:rPr>
+        <w:t xml:space="preserve"> </w:t>
+      </w:r>
+      <w:r>
+        <w:rPr>
+          <w:rStyle w:val="KeywordTok"/>
+        </w:rPr>
+        <w:t xml:space="preserve">false</w:t>
+      </w:r>
+      <w:r>
+        <w:rPr>
+          <w:rStyle w:val="FunctionTok"/>
+        </w:rPr>
+        <w:t xml:space="preserve">,</w:t>
+      </w:r>
+      <w:r>
+        <w:rPr>
+          <w:rStyle w:val="NormalTok"/>
+        </w:rPr>
+        <w:t xml:space="preserve"> </w:t>
+      </w:r>
+      <w:r>
+        <w:rPr>
+          <w:rStyle w:val="DataTypeTok"/>
+        </w:rPr>
+        <w:t xml:space="preserve">"isBlockedBy"</w:t>
+      </w:r>
+      <w:r>
+        <w:rPr>
+          <w:rStyle w:val="FunctionTok"/>
+        </w:rPr>
+        <w:t xml:space="preserve">:</w:t>
+      </w:r>
+      <w:r>
+        <w:rPr>
+          <w:rStyle w:val="NormalTok"/>
+        </w:rPr>
+        <w:t xml:space="preserve"> </w:t>
+      </w:r>
+      <w:r>
+        <w:rPr>
+          <w:rStyle w:val="KeywordTok"/>
+        </w:rPr>
+        <w:t xml:space="preserve">false</w:t>
+      </w:r>
+      <w:r>
+        <w:br/>
+      </w:r>
+      <w:r>
+        <w:rPr>
+          <w:rStyle w:val="NormalTok"/>
+        </w:rPr>
+        <w:t xml:space="preserve">    </w:t>
+      </w:r>
+      <w:r>
+        <w:rPr>
+          <w:rStyle w:val="FunctionTok"/>
+        </w:rPr>
+        <w:t xml:space="preserve">},</w:t>
+      </w:r>
+      <w:r>
+        <w:br/>
+      </w:r>
+      <w:r>
+        <w:rPr>
+          <w:rStyle w:val="NormalTok"/>
+        </w:rPr>
+        <w:t xml:space="preserve">    </w:t>
+      </w:r>
+      <w:r>
+        <w:rPr>
+          <w:rStyle w:val="DataTypeTok"/>
+        </w:rPr>
+        <w:t xml:space="preserve">"isOwnProfile"</w:t>
+      </w:r>
+      <w:r>
+        <w:rPr>
+          <w:rStyle w:val="FunctionTok"/>
+        </w:rPr>
+        <w:t xml:space="preserve">:</w:t>
+      </w:r>
+      <w:r>
+        <w:rPr>
+          <w:rStyle w:val="NormalTok"/>
+        </w:rPr>
+        <w:t xml:space="preserve"> </w:t>
+      </w:r>
+      <w:r>
+        <w:rPr>
+          <w:rStyle w:val="KeywordTok"/>
+        </w:rPr>
+        <w:t xml:space="preserve">false</w:t>
+      </w:r>
+      <w:r>
+        <w:rPr>
+          <w:rStyle w:val="FunctionTok"/>
+        </w:rPr>
+        <w:t xml:space="preserve">,</w:t>
+      </w:r>
+      <w:r>
+        <w:br/>
+      </w:r>
+      <w:r>
+        <w:rPr>
+          <w:rStyle w:val="NormalTok"/>
+        </w:rPr>
+        <w:t xml:space="preserve">    </w:t>
+      </w:r>
+      <w:r>
+        <w:rPr>
+          <w:rStyle w:val="DataTypeTok"/>
+        </w:rPr>
+        <w:t xml:space="preserve">"achievements"</w:t>
+      </w:r>
+      <w:r>
+        <w:rPr>
+          <w:rStyle w:val="FunctionTok"/>
+        </w:rPr>
+        <w:t xml:space="preserve">:</w:t>
+      </w:r>
+      <w:r>
+        <w:rPr>
+          <w:rStyle w:val="NormalTok"/>
+        </w:rPr>
+        <w:t xml:space="preserve"> </w:t>
+      </w:r>
+      <w:r>
+        <w:rPr>
+          <w:rStyle w:val="OtherTok"/>
+        </w:rPr>
+        <w:t xml:space="preserve">[</w:t>
+      </w:r>
+      <w:r>
+        <w:rPr>
+          <w:rStyle w:val="FunctionTok"/>
+        </w:rPr>
+        <w:t xml:space="preserve">{</w:t>
+      </w:r>
+      <w:r>
+        <w:rPr>
+          <w:rStyle w:val="NormalTok"/>
+        </w:rPr>
+        <w:t xml:space="preserve"> </w:t>
+      </w:r>
+      <w:r>
+        <w:rPr>
+          <w:rStyle w:val="DataTypeTok"/>
+        </w:rPr>
+        <w:t xml:space="preserve">"id"</w:t>
+      </w:r>
+      <w:r>
+        <w:rPr>
+          <w:rStyle w:val="FunctionTok"/>
+        </w:rPr>
+        <w:t xml:space="preserve">,</w:t>
+      </w:r>
+      <w:r>
+        <w:rPr>
+          <w:rStyle w:val="NormalTok"/>
+        </w:rPr>
+        <w:t xml:space="preserve"> </w:t>
+      </w:r>
+      <w:r>
+        <w:rPr>
+          <w:rStyle w:val="DataTypeTok"/>
+        </w:rPr>
+        <w:t xml:space="preserve">"achievementId"</w:t>
+      </w:r>
+      <w:r>
+        <w:rPr>
+          <w:rStyle w:val="FunctionTok"/>
+        </w:rPr>
+        <w:t xml:space="preserve">,</w:t>
+      </w:r>
+      <w:r>
+        <w:rPr>
+          <w:rStyle w:val="NormalTok"/>
+        </w:rPr>
+        <w:t xml:space="preserve"> </w:t>
+      </w:r>
+      <w:r>
+        <w:rPr>
+          <w:rStyle w:val="DataTypeTok"/>
+        </w:rPr>
+        <w:t xml:space="preserve">"earnedAt"</w:t>
+      </w:r>
+      <w:r>
+        <w:rPr>
+          <w:rStyle w:val="FunctionTok"/>
+        </w:rPr>
+        <w:t xml:space="preserve">,</w:t>
+      </w:r>
+      <w:r>
+        <w:rPr>
+          <w:rStyle w:val="NormalTok"/>
+        </w:rPr>
+        <w:t xml:space="preserve"> </w:t>
+      </w:r>
+      <w:r>
+        <w:rPr>
+          <w:rStyle w:val="DataTypeTok"/>
+        </w:rPr>
+        <w:t xml:space="preserve">"progress"</w:t>
+      </w:r>
+      <w:r>
+        <w:rPr>
+          <w:rStyle w:val="FunctionTok"/>
+        </w:rPr>
+        <w:t xml:space="preserve">,</w:t>
+      </w:r>
+      <w:r>
+        <w:rPr>
+          <w:rStyle w:val="NormalTok"/>
+        </w:rPr>
+        <w:t xml:space="preserve"> </w:t>
+      </w:r>
+      <w:r>
+        <w:rPr>
+          <w:rStyle w:val="DataTypeTok"/>
+        </w:rPr>
+        <w:t xml:space="preserve">"isCompleted"</w:t>
+      </w:r>
+      <w:r>
+        <w:rPr>
+          <w:rStyle w:val="NormalTok"/>
+        </w:rPr>
+        <w:t xml:space="preserve"> </w:t>
+      </w:r>
+      <w:r>
+        <w:rPr>
+          <w:rStyle w:val="FunctionTok"/>
+        </w:rPr>
+        <w:t xml:space="preserve">}</w:t>
+      </w:r>
+      <w:r>
+        <w:rPr>
+          <w:rStyle w:val="OtherTok"/>
+        </w:rPr>
+        <w:t xml:space="preserve">]</w:t>
+      </w:r>
+      <w:r>
+        <w:rPr>
+          <w:rStyle w:val="FunctionTok"/>
+        </w:rPr>
+        <w:t xml:space="preserve">,</w:t>
+      </w:r>
+      <w:r>
+        <w:br/>
+      </w:r>
+      <w:r>
+        <w:rPr>
+          <w:rStyle w:val="NormalTok"/>
+        </w:rPr>
+        <w:t xml:space="preserve">    </w:t>
+      </w:r>
+      <w:r>
+        <w:rPr>
+          <w:rStyle w:val="DataTypeTok"/>
+        </w:rPr>
+        <w:t xml:space="preserve">"recentActivity"</w:t>
+      </w:r>
+      <w:r>
+        <w:rPr>
+          <w:rStyle w:val="FunctionTok"/>
+        </w:rPr>
+        <w:t xml:space="preserve">:</w:t>
+      </w:r>
+      <w:r>
+        <w:rPr>
+          <w:rStyle w:val="NormalTok"/>
+        </w:rPr>
+        <w:t xml:space="preserve"> </w:t>
+      </w:r>
+      <w:r>
+        <w:rPr>
+          <w:rStyle w:val="FunctionTok"/>
+        </w:rPr>
+        <w:t xml:space="preserve">{</w:t>
+      </w:r>
+      <w:r>
+        <w:br/>
+      </w:r>
+      <w:r>
+        <w:rPr>
+          <w:rStyle w:val="NormalTok"/>
+        </w:rPr>
+        <w:t xml:space="preserve">      </w:t>
+      </w:r>
+      <w:r>
+        <w:rPr>
+          <w:rStyle w:val="DataTypeTok"/>
+        </w:rPr>
+        <w:t xml:space="preserve">"shortVideos"</w:t>
+      </w:r>
+      <w:r>
+        <w:rPr>
+          <w:rStyle w:val="FunctionTok"/>
+        </w:rPr>
+        <w:t xml:space="preserve">:</w:t>
+      </w:r>
+      <w:r>
+        <w:rPr>
+          <w:rStyle w:val="NormalTok"/>
+        </w:rPr>
+        <w:t xml:space="preserve"> </w:t>
+      </w:r>
+      <w:r>
+        <w:rPr>
+          <w:rStyle w:val="OtherTok"/>
+        </w:rPr>
+        <w:t xml:space="preserve">[</w:t>
+      </w:r>
+      <w:r>
+        <w:rPr>
+          <w:rStyle w:val="FunctionTok"/>
+        </w:rPr>
+        <w:t xml:space="preserve">{</w:t>
+      </w:r>
+      <w:r>
+        <w:rPr>
+          <w:rStyle w:val="NormalTok"/>
+        </w:rPr>
+        <w:t xml:space="preserve"> </w:t>
+      </w:r>
+      <w:r>
+        <w:rPr>
+          <w:rStyle w:val="DataTypeTok"/>
+        </w:rPr>
+        <w:t xml:space="preserve">"id"</w:t>
+      </w:r>
+      <w:r>
+        <w:rPr>
+          <w:rStyle w:val="FunctionTok"/>
+        </w:rPr>
+        <w:t xml:space="preserve">,</w:t>
+      </w:r>
+      <w:r>
+        <w:rPr>
+          <w:rStyle w:val="NormalTok"/>
+        </w:rPr>
+        <w:t xml:space="preserve"> </w:t>
+      </w:r>
+      <w:r>
+        <w:rPr>
+          <w:rStyle w:val="DataTypeTok"/>
+        </w:rPr>
+        <w:t xml:space="preserve">"title"</w:t>
+      </w:r>
+      <w:r>
+        <w:rPr>
+          <w:rStyle w:val="FunctionTok"/>
+        </w:rPr>
+        <w:t xml:space="preserve">,</w:t>
+      </w:r>
+      <w:r>
+        <w:rPr>
+          <w:rStyle w:val="NormalTok"/>
+        </w:rPr>
+        <w:t xml:space="preserve"> </w:t>
+      </w:r>
+      <w:r>
+        <w:rPr>
+          <w:rStyle w:val="DataTypeTok"/>
+        </w:rPr>
+        <w:t xml:space="preserve">"thumbnailUrl"</w:t>
+      </w:r>
+      <w:r>
+        <w:rPr>
+          <w:rStyle w:val="FunctionTok"/>
+        </w:rPr>
+        <w:t xml:space="preserve">,</w:t>
+      </w:r>
+      <w:r>
+        <w:rPr>
+          <w:rStyle w:val="NormalTok"/>
+        </w:rPr>
+        <w:t xml:space="preserve"> </w:t>
+      </w:r>
+      <w:r>
+        <w:rPr>
+          <w:rStyle w:val="DataTypeTok"/>
+        </w:rPr>
+        <w:t xml:space="preserve">"viewCount"</w:t>
+      </w:r>
+      <w:r>
+        <w:rPr>
+          <w:rStyle w:val="FunctionTok"/>
+        </w:rPr>
+        <w:t xml:space="preserve">,</w:t>
+      </w:r>
+      <w:r>
+        <w:rPr>
+          <w:rStyle w:val="NormalTok"/>
+        </w:rPr>
+        <w:t xml:space="preserve"> </w:t>
+      </w:r>
+      <w:r>
+        <w:rPr>
+          <w:rStyle w:val="DataTypeTok"/>
+        </w:rPr>
+        <w:t xml:space="preserve">"createdAt"</w:t>
+      </w:r>
+      <w:r>
+        <w:rPr>
+          <w:rStyle w:val="NormalTok"/>
+        </w:rPr>
+        <w:t xml:space="preserve"> </w:t>
+      </w:r>
+      <w:r>
+        <w:rPr>
+          <w:rStyle w:val="FunctionTok"/>
+        </w:rPr>
+        <w:t xml:space="preserve">}</w:t>
+      </w:r>
+      <w:r>
+        <w:rPr>
+          <w:rStyle w:val="OtherTok"/>
+        </w:rPr>
+        <w:t xml:space="preserve">]</w:t>
+      </w:r>
+      <w:r>
+        <w:rPr>
+          <w:rStyle w:val="FunctionTok"/>
+        </w:rPr>
+        <w:t xml:space="preserve">,</w:t>
+      </w:r>
+      <w:r>
+        <w:br/>
+      </w:r>
+      <w:r>
+        <w:rPr>
+          <w:rStyle w:val="NormalTok"/>
+        </w:rPr>
+        <w:t xml:space="preserve">      </w:t>
+      </w:r>
+      <w:r>
+        <w:rPr>
+          <w:rStyle w:val="DataTypeTok"/>
+        </w:rPr>
+        <w:t xml:space="preserve">"posts"</w:t>
+      </w:r>
+      <w:r>
+        <w:rPr>
+          <w:rStyle w:val="FunctionTok"/>
+        </w:rPr>
+        <w:t xml:space="preserve">:</w:t>
+      </w:r>
+      <w:r>
+        <w:rPr>
+          <w:rStyle w:val="NormalTok"/>
+        </w:rPr>
+        <w:t xml:space="preserve"> </w:t>
+      </w:r>
+      <w:r>
+        <w:rPr>
+          <w:rStyle w:val="OtherTok"/>
+        </w:rPr>
+        <w:t xml:space="preserve">[</w:t>
+      </w:r>
+      <w:r>
+        <w:rPr>
+          <w:rStyle w:val="FunctionTok"/>
+        </w:rPr>
+        <w:t xml:space="preserve">{</w:t>
+      </w:r>
+      <w:r>
+        <w:rPr>
+          <w:rStyle w:val="NormalTok"/>
+        </w:rPr>
+        <w:t xml:space="preserve"> </w:t>
+      </w:r>
+      <w:r>
+        <w:rPr>
+          <w:rStyle w:val="DataTypeTok"/>
+        </w:rPr>
+        <w:t xml:space="preserve">"id"</w:t>
+      </w:r>
+      <w:r>
+        <w:rPr>
+          <w:rStyle w:val="FunctionTok"/>
+        </w:rPr>
+        <w:t xml:space="preserve">,</w:t>
+      </w:r>
+      <w:r>
+        <w:rPr>
+          <w:rStyle w:val="NormalTok"/>
+        </w:rPr>
+        <w:t xml:space="preserve"> </w:t>
+      </w:r>
+      <w:r>
+        <w:rPr>
+          <w:rStyle w:val="DataTypeTok"/>
+        </w:rPr>
+        <w:t xml:space="preserve">"content"</w:t>
+      </w:r>
+      <w:r>
+        <w:rPr>
+          <w:rStyle w:val="FunctionTok"/>
+        </w:rPr>
+        <w:t xml:space="preserve">,</w:t>
+      </w:r>
+      <w:r>
+        <w:rPr>
+          <w:rStyle w:val="NormalTok"/>
+        </w:rPr>
+        <w:t xml:space="preserve"> </w:t>
+      </w:r>
+      <w:r>
+        <w:rPr>
+          <w:rStyle w:val="DataTypeTok"/>
+        </w:rPr>
+        <w:t xml:space="preserve">"createdAt"</w:t>
+      </w:r>
+      <w:r>
+        <w:rPr>
+          <w:rStyle w:val="FunctionTok"/>
+        </w:rPr>
+        <w:t xml:space="preserve">,</w:t>
+      </w:r>
+      <w:r>
+        <w:rPr>
+          <w:rStyle w:val="NormalTok"/>
+        </w:rPr>
+        <w:t xml:space="preserve"> </w:t>
+      </w:r>
+      <w:r>
+        <w:rPr>
+          <w:rStyle w:val="DataTypeTok"/>
+        </w:rPr>
+        <w:t xml:space="preserve">"likeCount"</w:t>
+      </w:r>
+      <w:r>
+        <w:rPr>
+          <w:rStyle w:val="FunctionTok"/>
+        </w:rPr>
+        <w:t xml:space="preserve">,</w:t>
+      </w:r>
+      <w:r>
+        <w:rPr>
+          <w:rStyle w:val="NormalTok"/>
+        </w:rPr>
+        <w:t xml:space="preserve"> </w:t>
+      </w:r>
+      <w:r>
+        <w:rPr>
+          <w:rStyle w:val="DataTypeTok"/>
+        </w:rPr>
+        <w:t xml:space="preserve">"commentCount"</w:t>
+      </w:r>
+      <w:r>
+        <w:rPr>
+          <w:rStyle w:val="NormalTok"/>
+        </w:rPr>
+        <w:t xml:space="preserve"> </w:t>
+      </w:r>
+      <w:r>
+        <w:rPr>
+          <w:rStyle w:val="FunctionTok"/>
+        </w:rPr>
+        <w:t xml:space="preserve">}</w:t>
+      </w:r>
+      <w:r>
+        <w:rPr>
+          <w:rStyle w:val="OtherTok"/>
+        </w:rPr>
+        <w:t xml:space="preserve">]</w:t>
+      </w:r>
+      <w:r>
+        <w:br/>
+      </w:r>
+      <w:r>
+        <w:rPr>
+          <w:rStyle w:val="NormalTok"/>
+        </w:rPr>
+        <w:t xml:space="preserve">    </w:t>
+      </w:r>
+      <w:r>
+        <w:rPr>
+          <w:rStyle w:val="FunctionTok"/>
+        </w:rPr>
+        <w:t xml:space="preserve">}</w:t>
+      </w:r>
+      <w:r>
+        <w:br/>
+      </w:r>
+      <w:r>
+        <w:rPr>
+          <w:rStyle w:val="NormalTok"/>
+        </w:rPr>
+        <w:t xml:space="preserve">  </w:t>
+      </w:r>
+      <w:r>
+        <w:rPr>
+          <w:rStyle w:val="FunctionTok"/>
+        </w:rPr>
+        <w:t xml:space="preserve">}</w:t>
+      </w:r>
+      <w:r>
+        <w:br/>
+      </w:r>
+      <w:r>
+        <w:rPr>
+          <w:rStyle w:val="FunctionTok"/>
+        </w:rPr>
+        <w:t xml:space="preserve">}</w:t>
+      </w:r>
+    </w:p>
+    <w:p>
+      <w:r>
+        <w:pict>
+          <v:rect style="width:0;height:1.5pt" o:hralign="center" o:hrstd="t" o:hr="t"/>
+        </w:pict>
+      </w:r>
+    </w:p>
+    <w:bookmarkEnd w:id="52"/>
+    <w:bookmarkStart w:id="53" w:name="önerilen-mobil-akış"/>
+    <w:p>
+      <w:pPr>
+        <w:pStyle w:val="Heading3"/>
+      </w:pPr>
+      <w:r>
+        <w:t xml:space="preserve">🔄 Önerilen Mobil Akış</w:t>
+      </w:r>
+    </w:p>
+    <w:p>
+      <w:pPr>
+        <w:pStyle w:val="SourceCode"/>
+      </w:pPr>
+      <w:r>
+        <w:rPr>
+          <w:rStyle w:val="VerbatimChar"/>
+        </w:rPr>
+        <w:t xml:space="preserve">1. Kullanıcı giriş → POST /api/auth/mobile-login → JWT token al</w:t>
+      </w:r>
+      <w:r>
+        <w:br/>
+      </w:r>
+      <w:r>
+        <w:rPr>
+          <w:rStyle w:val="VerbatimChar"/>
+        </w:rPr>
+        <w:t xml:space="preserve">2. Ana sayfa → GET /api/mobile/home → Tek istekle tüm feed verisi</w:t>
+      </w:r>
+      <w:r>
+        <w:br/>
+      </w:r>
+      <w:r>
+        <w:rPr>
+          <w:rStyle w:val="VerbatimChar"/>
+        </w:rPr>
+        <w:t xml:space="preserve">3. Fal menüsü → GET /api/mobile/fortune-menu → Fal türleri + bakiye</w:t>
+      </w:r>
+      <w:r>
+        <w:br/>
+      </w:r>
+      <w:r>
+        <w:rPr>
+          <w:rStyle w:val="VerbatimChar"/>
+        </w:rPr>
+        <w:t xml:space="preserve">4. Kullanıcı profili → GET /api/mobile/user-profile/{userId}</w:t>
+      </w:r>
+      <w:r>
+        <w:br/>
+      </w:r>
+      <w:r>
+        <w:rPr>
+          <w:rStyle w:val="VerbatimChar"/>
+        </w:rPr>
+        <w:t xml:space="preserve">5. Bildirimler → GET /api/notifications</w:t>
+      </w:r>
+      <w:r>
+        <w:br/>
+      </w:r>
+      <w:r>
+        <w:rPr>
+          <w:rStyle w:val="VerbatimChar"/>
+        </w:rPr>
+        <w:t xml:space="preserve">6. Canlı yayın → GET /api/live/rooms → POST /api/live/join-room</w:t>
+      </w:r>
+    </w:p>
+    <w:p>
+      <w:r>
+        <w:pict>
+          <v:rect style="width:0;height:1.5pt" o:hralign="center" o:hrstd="t" o:hr="t"/>
+        </w:pict>
+      </w:r>
+    </w:p>
+    <w:p>
+      <w:pPr>
+        <w:pStyle w:val="FirstParagraph"/>
+      </w:pPr>
+      <w:r>
         <w:rPr>
           <w:iCs/>
           <w:i/>
@@ -14081,8 +18105,9 @@
         <w:t xml:space="preserve">Bu döküman CanlıFal Flutter ekibi için hazırlanmıştır.</w:t>
       </w:r>
     </w:p>
-    <w:bookmarkEnd w:id="49"/>
-    <w:bookmarkEnd w:id="50"/>
+    <w:bookmarkEnd w:id="53"/>
+    <w:bookmarkEnd w:id="54"/>
+    <w:bookmarkEnd w:id="55"/>
     <w:sectPr/>
   </w:body>
 </w:document>

</xml_diff>